<commit_message>
fix broken link to Ottawa form and standardize appearance in instructions; comment out fake links;
</commit_message>
<xml_diff>
--- a/docassemble/MLHDivorceAndCustody/data/templates/instructions_divorce_with_children.docx
+++ b/docassemble/MLHDivorceAndCustody/data/templates/instructions_divorce_with_children.docx
@@ -8,16 +8,29 @@
       </w:pPr>
       <w:bookmarkStart w:id="0" w:name="_heading=h.vrrcby7wzmz8" w:colFirst="0" w:colLast="0"/>
       <w:bookmarkEnd w:id="0"/>
+      <w:proofErr w:type="gramStart"/>
       <w:r>
         <w:t xml:space="preserve">{{ </w:t>
       </w:r>
       <w:proofErr w:type="spellStart"/>
       <w:r>
-        <w:t>county_choice</w:t>
+        <w:t>county</w:t>
+      </w:r>
+      <w:proofErr w:type="gramEnd"/>
+      <w:r>
+        <w:t>_</w:t>
+      </w:r>
+      <w:proofErr w:type="gramStart"/>
+      <w:r>
+        <w:t>choice</w:t>
       </w:r>
       <w:proofErr w:type="spellEnd"/>
       <w:r>
-        <w:t xml:space="preserve"> }} County </w:t>
+        <w:t xml:space="preserve"> }</w:t>
+      </w:r>
+      <w:proofErr w:type="gramEnd"/>
+      <w:r>
+        <w:t xml:space="preserve">} County </w:t>
       </w:r>
       <w:r>
         <w:t>Instru</w:t>
@@ -157,22 +170,46 @@
           <w:b/>
           <w:color w:val="222222"/>
         </w:rPr>
-        <w:t>Note: These instructions are general instructions for use in any Michigan County. Please be aware that some steps will vary from county to county. Specific instructions for your county are not yet available. Contact your circuit court clerk’s office to find out which steps might be different in your county.</w:t>
-      </w:r>
-    </w:p>
-    <w:p>
-      <w:pPr>
-        <w:spacing w:before="180" w:after="180"/>
-        <w:rPr>
-          <w:color w:val="222222"/>
-        </w:rPr>
-      </w:pPr>
-      <w:r>
-        <w:rPr>
-          <w:color w:val="222222"/>
-        </w:rPr>
-        <w:t>{%p endif %}</w:t>
-      </w:r>
+        <w:t xml:space="preserve">Note: These instructions are general instructions for use in any Michigan County. Please be aware that some steps will vary from county to county. Specific instructions for your </w:t>
+      </w:r>
+      <w:proofErr w:type="gramStart"/>
+      <w:r>
+        <w:rPr>
+          <w:b/>
+          <w:color w:val="222222"/>
+        </w:rPr>
+        <w:t>county</w:t>
+      </w:r>
+      <w:proofErr w:type="gramEnd"/>
+      <w:r>
+        <w:rPr>
+          <w:b/>
+          <w:color w:val="222222"/>
+        </w:rPr>
+        <w:t xml:space="preserve"> are not yet available. Contact your circuit court clerk’s office to find out which steps might be different in your county.</w:t>
+      </w:r>
+    </w:p>
+    <w:p>
+      <w:pPr>
+        <w:spacing w:before="180" w:after="180"/>
+        <w:rPr>
+          <w:color w:val="222222"/>
+        </w:rPr>
+      </w:pPr>
+      <w:r>
+        <w:rPr>
+          <w:color w:val="222222"/>
+        </w:rPr>
+        <w:t xml:space="preserve">{%p </w:t>
+      </w:r>
+      <w:proofErr w:type="gramStart"/>
+      <w:r>
+        <w:rPr>
+          <w:color w:val="222222"/>
+        </w:rPr>
+        <w:t>endif %}</w:t>
+      </w:r>
+      <w:proofErr w:type="gramEnd"/>
     </w:p>
     <w:p>
       <w:pPr>
@@ -200,7 +237,21 @@
         <w:rPr>
           <w:color w:val="222222"/>
         </w:rPr>
-        <w:t xml:space="preserve"> tool to prepare the forms that you need. You will not file all of these forms at the beginning of your case; some you will file later. You will need to make copies of some of the forms. The instructions below explain which forms you need for each step and how many copies to make.</w:t>
+        <w:t xml:space="preserve"> tool to prepare the forms that you need. You will not file </w:t>
+      </w:r>
+      <w:proofErr w:type="gramStart"/>
+      <w:r>
+        <w:rPr>
+          <w:color w:val="222222"/>
+        </w:rPr>
+        <w:t>all of</w:t>
+      </w:r>
+      <w:proofErr w:type="gramEnd"/>
+      <w:r>
+        <w:rPr>
+          <w:color w:val="222222"/>
+        </w:rPr>
+        <w:t xml:space="preserve"> these forms at the beginning of your case; some you will file later. You will need to make copies of some of the forms. The instructions below explain which forms you need for each step and how many copies to make.</w:t>
       </w:r>
     </w:p>
     <w:p>
@@ -441,7 +492,21 @@
         <w:rPr>
           <w:color w:val="222222"/>
         </w:rPr>
-        <w:t>Complaint for Divorce with Children</w:t>
+        <w:t xml:space="preserve">Complaint </w:t>
+      </w:r>
+      <w:proofErr w:type="gramStart"/>
+      <w:r>
+        <w:rPr>
+          <w:color w:val="222222"/>
+        </w:rPr>
+        <w:t>for</w:t>
+      </w:r>
+      <w:proofErr w:type="gramEnd"/>
+      <w:r>
+        <w:rPr>
+          <w:color w:val="222222"/>
+        </w:rPr>
+        <w:t xml:space="preserve"> Divorce with Children</w:t>
       </w:r>
     </w:p>
     <w:p>
@@ -523,7 +588,15 @@
       </w:r>
       <w:r>
         <w:lastRenderedPageBreak/>
-        <w:t>identifying information on the forms that will be filed in the public court file. Fill out the caption, but leave the rest of the form blank.</w:t>
+        <w:t xml:space="preserve">identifying information on the forms that will be filed in the public court file. Fill out the </w:t>
+      </w:r>
+      <w:proofErr w:type="gramStart"/>
+      <w:r>
+        <w:t>caption, but</w:t>
+      </w:r>
+      <w:proofErr w:type="gramEnd"/>
+      <w:r>
+        <w:t xml:space="preserve"> leave the rest of the form blank.</w:t>
       </w:r>
     </w:p>
     <w:p>
@@ -560,13 +633,18 @@
         </w:r>
       </w:hyperlink>
       <w:r>
-        <w:t xml:space="preserve">: Click the link to download this form. This form is not produced by the DIY tool. On the Certificate on Behalf of Plaintiff form, check the boxes that apply to you. Note that getting an ex </w:t>
+        <w:t xml:space="preserve">: Click the link to download this form. This form is not produced by the DIY tool. On the Certificate on Behalf of Plaintiff form, check the boxes that apply to you. Note that getting an </w:t>
+      </w:r>
+      <w:proofErr w:type="gramStart"/>
+      <w:r>
+        <w:t xml:space="preserve">ex </w:t>
       </w:r>
       <w:proofErr w:type="spellStart"/>
       <w:r>
         <w:t>parte</w:t>
       </w:r>
       <w:proofErr w:type="spellEnd"/>
+      <w:proofErr w:type="gramEnd"/>
       <w:r>
         <w:t xml:space="preserve"> order is not simple. Neither the Do-It-Yourself Divorce nor the Michigan Legal Help website will help you draft or file a request for an ex </w:t>
       </w:r>
@@ -584,21 +662,43 @@
       </w:r>
       <w:proofErr w:type="spellEnd"/>
       <w:r>
-        <w:t xml:space="preserve"> interim order, you should talk to a lawyer. Indicate on the Certificate on Behalf of Plaintiff form that you want to request a Friend of the Court investigation. The Friend of the Court will schedule the investigation. At that time, child support will be calculated and custody and parenting time issues will be addressed.</w:t>
-      </w:r>
-    </w:p>
-    <w:p>
-      <w:pPr>
-        <w:spacing w:before="180" w:after="180"/>
-        <w:rPr>
-          <w:color w:val="222222"/>
-        </w:rPr>
-      </w:pPr>
-      <w:r>
-        <w:rPr>
-          <w:color w:val="222222"/>
-        </w:rPr>
-        <w:t xml:space="preserve">In Wayne County you will not file the Summons generated by the Do-It-Yourself Divorce. If you file in person at the court, the clerk will print the Summons for you when you file your Complaint for Divorce. If you file online through the Domestic Case Filings System, you will need to create an </w:t>
+        <w:t xml:space="preserve"> interim order, you should talk to a lawyer. Indicate on the Certificate on Behalf of Plaintiff form that you want to request a Friend of the Court investigation. The Friend of the Court will schedule the investigation. At that time, child support will be </w:t>
+      </w:r>
+      <w:proofErr w:type="gramStart"/>
+      <w:r>
+        <w:t>calculated</w:t>
+      </w:r>
+      <w:proofErr w:type="gramEnd"/>
+      <w:r>
+        <w:t xml:space="preserve"> and custody and parenting time issues will be addressed.</w:t>
+      </w:r>
+    </w:p>
+    <w:p>
+      <w:pPr>
+        <w:spacing w:before="180" w:after="180"/>
+        <w:rPr>
+          <w:color w:val="222222"/>
+        </w:rPr>
+      </w:pPr>
+      <w:r>
+        <w:rPr>
+          <w:color w:val="222222"/>
+        </w:rPr>
+        <w:t xml:space="preserve">In Wayne County you will not file the Summons generated by the Do-It-Yourself Divorce. If you file in person </w:t>
+      </w:r>
+      <w:proofErr w:type="gramStart"/>
+      <w:r>
+        <w:rPr>
+          <w:color w:val="222222"/>
+        </w:rPr>
+        <w:t>at</w:t>
+      </w:r>
+      <w:proofErr w:type="gramEnd"/>
+      <w:r>
+        <w:rPr>
+          <w:color w:val="222222"/>
+        </w:rPr>
+        <w:t xml:space="preserve"> the court, the clerk will print the Summons for you when you file your Complaint for Divorce. If you file online through the Domestic Case Filings System, you will need to create an </w:t>
       </w:r>
       <w:proofErr w:type="spellStart"/>
       <w:r>
@@ -626,7 +726,14 @@
         <w:rPr>
           <w:color w:val="222222"/>
         </w:rPr>
-        <w:t xml:space="preserve">Step 5 has more information on filing and creating an </w:t>
+        <w:t xml:space="preserve">Step 5 has more information on filing and creating </w:t>
+      </w:r>
+      <w:proofErr w:type="gramStart"/>
+      <w:r>
+        <w:rPr>
+          <w:color w:val="222222"/>
+        </w:rPr>
+        <w:t xml:space="preserve">an </w:t>
       </w:r>
       <w:proofErr w:type="spellStart"/>
       <w:r>
@@ -636,6 +743,7 @@
         <w:t>eSummons</w:t>
       </w:r>
       <w:proofErr w:type="spellEnd"/>
+      <w:proofErr w:type="gramEnd"/>
       <w:r>
         <w:rPr>
           <w:color w:val="222222"/>
@@ -654,8 +762,16 @@
         <w:rPr>
           <w:color w:val="222222"/>
         </w:rPr>
-        <w:t>{%p else %}</w:t>
-      </w:r>
+        <w:t xml:space="preserve">{%p </w:t>
+      </w:r>
+      <w:proofErr w:type="gramStart"/>
+      <w:r>
+        <w:rPr>
+          <w:color w:val="222222"/>
+        </w:rPr>
+        <w:t>else %}</w:t>
+      </w:r>
+      <w:proofErr w:type="gramEnd"/>
       <w:r>
         <w:rPr>
           <w:color w:val="222222"/>
@@ -780,8 +896,16 @@
         <w:rPr>
           <w:color w:val="222222"/>
         </w:rPr>
-        <w:t>{%p endif %}</w:t>
-      </w:r>
+        <w:t xml:space="preserve">{%p </w:t>
+      </w:r>
+      <w:proofErr w:type="gramStart"/>
+      <w:r>
+        <w:rPr>
+          <w:color w:val="222222"/>
+        </w:rPr>
+        <w:t>endif %}</w:t>
+      </w:r>
+      <w:proofErr w:type="gramEnd"/>
     </w:p>
     <w:p>
       <w:pPr>
@@ -918,7 +1042,21 @@
         <w:rPr>
           <w:color w:val="222222"/>
         </w:rPr>
-        <w:t xml:space="preserve"> is only available for some courts. Even in courts where it is available, you can only use it for some case types. The State Court Administrative Office keeps a </w:t>
+        <w:t xml:space="preserve"> is only available for </w:t>
+      </w:r>
+      <w:proofErr w:type="gramStart"/>
+      <w:r>
+        <w:rPr>
+          <w:color w:val="222222"/>
+        </w:rPr>
+        <w:t>some courts</w:t>
+      </w:r>
+      <w:proofErr w:type="gramEnd"/>
+      <w:r>
+        <w:rPr>
+          <w:color w:val="222222"/>
+        </w:rPr>
+        <w:t xml:space="preserve">. Even in courts where it is available, you can only use it for some case types. The State Court Administrative Office keeps a </w:t>
       </w:r>
       <w:hyperlink r:id="rId17">
         <w:r>
@@ -1046,8 +1184,16 @@
         <w:rPr>
           <w:color w:val="222222"/>
         </w:rPr>
-        <w:t>{%p endif %}</w:t>
-      </w:r>
+        <w:t xml:space="preserve">{%p </w:t>
+      </w:r>
+      <w:proofErr w:type="gramStart"/>
+      <w:r>
+        <w:rPr>
+          <w:color w:val="222222"/>
+        </w:rPr>
+        <w:t>endif %}</w:t>
+      </w:r>
+      <w:proofErr w:type="gramEnd"/>
     </w:p>
     <w:p>
       <w:pPr>
@@ -1296,36 +1442,66 @@
         <w:rPr>
           <w:color w:val="222222"/>
         </w:rPr>
-        <w:t>{%p else %}</w:t>
-      </w:r>
-    </w:p>
-    <w:p>
-      <w:pPr>
-        <w:spacing w:before="180" w:after="180"/>
-        <w:rPr>
-          <w:color w:val="222222"/>
-        </w:rPr>
-      </w:pPr>
-      <w:r>
-        <w:rPr>
-          <w:color w:val="222222"/>
-        </w:rPr>
-        <w:t>It will cost you at least $175 to file a complaint for divorce with minor children. There is also an $80 judgment fee due at the time of filing. There may be more costs, such as charges for having papers served on your child’s other parent, motion filing fees, and costs for alternative dispute resolution services (mediation).</w:t>
-      </w:r>
-    </w:p>
-    <w:p>
-      <w:pPr>
-        <w:spacing w:before="180" w:after="180"/>
-        <w:rPr>
-          <w:color w:val="222222"/>
-        </w:rPr>
-      </w:pPr>
-      <w:r>
-        <w:rPr>
-          <w:color w:val="222222"/>
-        </w:rPr>
-        <w:t>{%p endif %}</w:t>
-      </w:r>
+        <w:t xml:space="preserve">{%p </w:t>
+      </w:r>
+      <w:proofErr w:type="gramStart"/>
+      <w:r>
+        <w:rPr>
+          <w:color w:val="222222"/>
+        </w:rPr>
+        <w:t>else %}</w:t>
+      </w:r>
+      <w:proofErr w:type="gramEnd"/>
+    </w:p>
+    <w:p>
+      <w:pPr>
+        <w:spacing w:before="180" w:after="180"/>
+        <w:rPr>
+          <w:color w:val="222222"/>
+        </w:rPr>
+      </w:pPr>
+      <w:r>
+        <w:rPr>
+          <w:color w:val="222222"/>
+        </w:rPr>
+        <w:t xml:space="preserve">It will cost you at least $175 to file a complaint for divorce with minor children. There is also an $80 judgment fee due at the time of filing. There may be more costs, such as charges for having papers served on your child’s other </w:t>
+      </w:r>
+      <w:proofErr w:type="gramStart"/>
+      <w:r>
+        <w:rPr>
+          <w:color w:val="222222"/>
+        </w:rPr>
+        <w:t>parent</w:t>
+      </w:r>
+      <w:proofErr w:type="gramEnd"/>
+      <w:r>
+        <w:rPr>
+          <w:color w:val="222222"/>
+        </w:rPr>
+        <w:t>, motion filing fees, and costs for alternative dispute resolution services (mediation).</w:t>
+      </w:r>
+    </w:p>
+    <w:p>
+      <w:pPr>
+        <w:spacing w:before="180" w:after="180"/>
+        <w:rPr>
+          <w:color w:val="222222"/>
+        </w:rPr>
+      </w:pPr>
+      <w:r>
+        <w:rPr>
+          <w:color w:val="222222"/>
+        </w:rPr>
+        <w:t xml:space="preserve">{%p </w:t>
+      </w:r>
+      <w:proofErr w:type="gramStart"/>
+      <w:r>
+        <w:rPr>
+          <w:color w:val="222222"/>
+        </w:rPr>
+        <w:t>endif %}</w:t>
+      </w:r>
+      <w:proofErr w:type="gramEnd"/>
     </w:p>
     <w:p>
       <w:pPr>
@@ -1352,7 +1528,21 @@
         <w:rPr>
           <w:color w:val="222222"/>
         </w:rPr>
-        <w:t xml:space="preserve"> == “Wayne” %}If you are unable to pay the filing fee, you can ask the court to waive it. Your case will not start until you pay the </w:t>
+        <w:t xml:space="preserve"> == “Wayne” </w:t>
+      </w:r>
+      <w:proofErr w:type="gramStart"/>
+      <w:r>
+        <w:rPr>
+          <w:color w:val="222222"/>
+        </w:rPr>
+        <w:t>%}If</w:t>
+      </w:r>
+      <w:proofErr w:type="gramEnd"/>
+      <w:r>
+        <w:rPr>
+          <w:color w:val="222222"/>
+        </w:rPr>
+        <w:t xml:space="preserve"> you are unable to pay the filing fee, you can ask the court to waive it. Your case will not start until you pay the </w:t>
       </w:r>
       <w:r>
         <w:rPr>
@@ -1360,24 +1550,96 @@
         </w:rPr>
         <w:t xml:space="preserve">filing </w:t>
       </w:r>
-      <w:r>
-        <w:rPr>
-          <w:color w:val="222222"/>
-        </w:rPr>
-        <w:t>fee or your Fee Waiver Request is approved.{% else %}</w:t>
-      </w:r>
-      <w:r>
-        <w:rPr>
-          <w:color w:val="222222"/>
-        </w:rPr>
-        <w:t>If you are unable to pay the filing fee and judgment fee, you can ask the court to waive them.</w:t>
-      </w:r>
-      <w:r>
-        <w:rPr>
-          <w:color w:val="222222"/>
-        </w:rPr>
-        <w:t xml:space="preserve"> Your case will not start until you pay the fees or your Fee Waiver Request is approved.{% endif %}</w:t>
-      </w:r>
+      <w:proofErr w:type="gramStart"/>
+      <w:r>
+        <w:rPr>
+          <w:color w:val="222222"/>
+        </w:rPr>
+        <w:t>fee</w:t>
+      </w:r>
+      <w:proofErr w:type="gramEnd"/>
+      <w:r>
+        <w:rPr>
+          <w:color w:val="222222"/>
+        </w:rPr>
+        <w:t xml:space="preserve"> or your Fee Waiver Request is </w:t>
+      </w:r>
+      <w:proofErr w:type="gramStart"/>
+      <w:r>
+        <w:rPr>
+          <w:color w:val="222222"/>
+        </w:rPr>
+        <w:t>approved.{</w:t>
+      </w:r>
+      <w:proofErr w:type="gramEnd"/>
+      <w:r>
+        <w:rPr>
+          <w:color w:val="222222"/>
+        </w:rPr>
+        <w:t xml:space="preserve">% else </w:t>
+      </w:r>
+      <w:proofErr w:type="gramStart"/>
+      <w:r>
+        <w:rPr>
+          <w:color w:val="222222"/>
+        </w:rPr>
+        <w:t>%}</w:t>
+      </w:r>
+      <w:r>
+        <w:rPr>
+          <w:color w:val="222222"/>
+        </w:rPr>
+        <w:t>If</w:t>
+      </w:r>
+      <w:proofErr w:type="gramEnd"/>
+      <w:r>
+        <w:rPr>
+          <w:color w:val="222222"/>
+        </w:rPr>
+        <w:t xml:space="preserve"> you are unable to pay the filing fee and judgment fee, you can ask the court to waive them.</w:t>
+      </w:r>
+      <w:r>
+        <w:rPr>
+          <w:color w:val="222222"/>
+        </w:rPr>
+        <w:t xml:space="preserve"> Your case will not start until you pay the </w:t>
+      </w:r>
+      <w:proofErr w:type="gramStart"/>
+      <w:r>
+        <w:rPr>
+          <w:color w:val="222222"/>
+        </w:rPr>
+        <w:t>fees</w:t>
+      </w:r>
+      <w:proofErr w:type="gramEnd"/>
+      <w:r>
+        <w:rPr>
+          <w:color w:val="222222"/>
+        </w:rPr>
+        <w:t xml:space="preserve"> or your Fee Waiver Request is </w:t>
+      </w:r>
+      <w:proofErr w:type="gramStart"/>
+      <w:r>
+        <w:rPr>
+          <w:color w:val="222222"/>
+        </w:rPr>
+        <w:t>approved.{</w:t>
+      </w:r>
+      <w:proofErr w:type="gramEnd"/>
+      <w:r>
+        <w:rPr>
+          <w:color w:val="222222"/>
+        </w:rPr>
+        <w:t xml:space="preserve">% </w:t>
+      </w:r>
+      <w:proofErr w:type="gramStart"/>
+      <w:r>
+        <w:rPr>
+          <w:color w:val="222222"/>
+        </w:rPr>
+        <w:t>endif %}</w:t>
+      </w:r>
+      <w:proofErr w:type="gramEnd"/>
     </w:p>
     <w:p>
       <w:pPr>
@@ -1405,8 +1667,16 @@
         <w:rPr>
           <w:color w:val="222222"/>
         </w:rPr>
-        <w:t>You receive public assistance based on having low income (examples: FAP, SNAP, Healthy Michigan, CHIP, ESO, FIP, TANF, WIC, SSI);</w:t>
-      </w:r>
+        <w:t>You receive public assistance based on having low income (examples: FAP, SNAP, Healthy Michigan, CHIP, ESO, FIP, TANF, WIC, SSI</w:t>
+      </w:r>
+      <w:proofErr w:type="gramStart"/>
+      <w:r>
+        <w:rPr>
+          <w:color w:val="222222"/>
+        </w:rPr>
+        <w:t>);</w:t>
+      </w:r>
+      <w:proofErr w:type="gramEnd"/>
     </w:p>
     <w:p>
       <w:pPr>
@@ -1539,7 +1809,23 @@
           <w:b/>
           <w:color w:val="222222"/>
         </w:rPr>
-        <w:t>A Fee Waiver Request can be filed in one of two ways:</w:t>
+        <w:t xml:space="preserve">A Fee Waiver Request can be filed in one </w:t>
+      </w:r>
+      <w:proofErr w:type="gramStart"/>
+      <w:r>
+        <w:rPr>
+          <w:b/>
+          <w:color w:val="222222"/>
+        </w:rPr>
+        <w:t>of</w:t>
+      </w:r>
+      <w:proofErr w:type="gramEnd"/>
+      <w:r>
+        <w:rPr>
+          <w:b/>
+          <w:color w:val="222222"/>
+        </w:rPr>
+        <w:t xml:space="preserve"> two ways:</w:t>
       </w:r>
     </w:p>
     <w:p>
@@ -1648,8 +1934,16 @@
         <w:rPr>
           <w:color w:val="222222"/>
         </w:rPr>
-        <w:t>{%p else %}</w:t>
-      </w:r>
+        <w:t xml:space="preserve">{%p </w:t>
+      </w:r>
+      <w:proofErr w:type="gramStart"/>
+      <w:r>
+        <w:rPr>
+          <w:color w:val="222222"/>
+        </w:rPr>
+        <w:t>else %}</w:t>
+      </w:r>
+      <w:proofErr w:type="gramEnd"/>
     </w:p>
     <w:p>
       <w:pPr>
@@ -1691,8 +1985,16 @@
         <w:rPr>
           <w:color w:val="222222"/>
         </w:rPr>
-        <w:t>{%p endif %}</w:t>
-      </w:r>
+        <w:t xml:space="preserve">{%p </w:t>
+      </w:r>
+      <w:proofErr w:type="gramStart"/>
+      <w:r>
+        <w:rPr>
+          <w:color w:val="222222"/>
+        </w:rPr>
+        <w:t>endif %}</w:t>
+      </w:r>
+      <w:proofErr w:type="gramEnd"/>
     </w:p>
     <w:p>
       <w:pPr>
@@ -1713,7 +2015,21 @@
         <w:rPr>
           <w:color w:val="222222"/>
         </w:rPr>
-        <w:t>You must sign and date each form that has a signature line. If you chose to sign electronically, this is already done. The electronic signature will look like this: /s/ Your Name.</w:t>
+        <w:t xml:space="preserve">You must sign and date each form that has a signature line. If you </w:t>
+      </w:r>
+      <w:proofErr w:type="gramStart"/>
+      <w:r>
+        <w:rPr>
+          <w:color w:val="222222"/>
+        </w:rPr>
+        <w:t>chose</w:t>
+      </w:r>
+      <w:proofErr w:type="gramEnd"/>
+      <w:r>
+        <w:rPr>
+          <w:color w:val="222222"/>
+        </w:rPr>
+        <w:t xml:space="preserve"> to sign electronically, this is already done. The electronic signature will look like this: /s/ Your Name.</w:t>
       </w:r>
     </w:p>
     <w:p>
@@ -1803,7 +2119,21 @@
         <w:rPr>
           <w:color w:val="222222"/>
         </w:rPr>
-        <w:t>” %}You may be able to get your document notarized at a bank or at the court clerk's office.</w:t>
+        <w:t xml:space="preserve">” </w:t>
+      </w:r>
+      <w:proofErr w:type="gramStart"/>
+      <w:r>
+        <w:rPr>
+          <w:color w:val="222222"/>
+        </w:rPr>
+        <w:t>%}You</w:t>
+      </w:r>
+      <w:proofErr w:type="gramEnd"/>
+      <w:r>
+        <w:rPr>
+          <w:color w:val="222222"/>
+        </w:rPr>
+        <w:t xml:space="preserve"> may be able to get your document notarized at a bank or at the court clerk's office.</w:t>
       </w:r>
       <w:r>
         <w:rPr>
@@ -1815,13 +2145,41 @@
         <w:rPr>
           <w:color w:val="222222"/>
         </w:rPr>
-        <w:t>{% else %}</w:t>
-      </w:r>
-      <w:r>
-        <w:rPr>
-          <w:color w:val="222222"/>
-        </w:rPr>
-        <w:t xml:space="preserve">You can usually find a notary at a bank </w:t>
+        <w:t xml:space="preserve">{% else </w:t>
+      </w:r>
+      <w:proofErr w:type="gramStart"/>
+      <w:r>
+        <w:rPr>
+          <w:color w:val="222222"/>
+        </w:rPr>
+        <w:t>%}</w:t>
+      </w:r>
+      <w:r>
+        <w:rPr>
+          <w:color w:val="222222"/>
+        </w:rPr>
+        <w:t>You</w:t>
+      </w:r>
+      <w:proofErr w:type="gramEnd"/>
+      <w:r>
+        <w:rPr>
+          <w:color w:val="222222"/>
+        </w:rPr>
+        <w:t xml:space="preserve"> can usually find a </w:t>
+      </w:r>
+      <w:proofErr w:type="gramStart"/>
+      <w:r>
+        <w:rPr>
+          <w:color w:val="222222"/>
+        </w:rPr>
+        <w:t>notary</w:t>
+      </w:r>
+      <w:proofErr w:type="gramEnd"/>
+      <w:r>
+        <w:rPr>
+          <w:color w:val="222222"/>
+        </w:rPr>
+        <w:t xml:space="preserve"> at a bank </w:t>
       </w:r>
       <w:r>
         <w:rPr>
@@ -1839,13 +2197,27 @@
         <w:rPr>
           <w:color w:val="222222"/>
         </w:rPr>
-        <w:t>{% endif %}</w:t>
-      </w:r>
-      <w:r>
-        <w:rPr>
-          <w:color w:val="222222"/>
-        </w:rPr>
-        <w:t xml:space="preserve">{% if </w:t>
+        <w:t xml:space="preserve">{% endif </w:t>
+      </w:r>
+      <w:proofErr w:type="gramStart"/>
+      <w:r>
+        <w:rPr>
+          <w:color w:val="222222"/>
+        </w:rPr>
+        <w:t>%}</w:t>
+      </w:r>
+      <w:r>
+        <w:rPr>
+          <w:color w:val="222222"/>
+        </w:rPr>
+        <w:t>{</w:t>
+      </w:r>
+      <w:proofErr w:type="gramEnd"/>
+      <w:r>
+        <w:rPr>
+          <w:color w:val="222222"/>
+        </w:rPr>
+        <w:t xml:space="preserve">% if </w:t>
       </w:r>
       <w:proofErr w:type="spellStart"/>
       <w:r>
@@ -1859,13 +2231,41 @@
         <w:rPr>
           <w:color w:val="222222"/>
         </w:rPr>
-        <w:t xml:space="preserve"> == “Barry” %}There is a $5 fee to sign in front of a court clerk. {% endif %}</w:t>
-      </w:r>
-      <w:r>
-        <w:rPr>
-          <w:color w:val="222222"/>
-        </w:rPr>
-        <w:t>Some copy and print shops also offer notary services for a fee. Contact the bank or other location to make sure that a notary will be available at the time you plan on going</w:t>
+        <w:t xml:space="preserve"> == “Barry” </w:t>
+      </w:r>
+      <w:proofErr w:type="gramStart"/>
+      <w:r>
+        <w:rPr>
+          <w:color w:val="222222"/>
+        </w:rPr>
+        <w:t>%}There</w:t>
+      </w:r>
+      <w:proofErr w:type="gramEnd"/>
+      <w:r>
+        <w:rPr>
+          <w:color w:val="222222"/>
+        </w:rPr>
+        <w:t xml:space="preserve"> is a $5 fee to sign in front of a court clerk. {% endif </w:t>
+      </w:r>
+      <w:proofErr w:type="gramStart"/>
+      <w:r>
+        <w:rPr>
+          <w:color w:val="222222"/>
+        </w:rPr>
+        <w:t>%}</w:t>
+      </w:r>
+      <w:r>
+        <w:rPr>
+          <w:color w:val="222222"/>
+        </w:rPr>
+        <w:t>Some</w:t>
+      </w:r>
+      <w:proofErr w:type="gramEnd"/>
+      <w:r>
+        <w:rPr>
+          <w:color w:val="222222"/>
+        </w:rPr>
+        <w:t xml:space="preserve"> copy and print shops also offer notary services for a fee. Contact the bank or other location to make sure that a notary will be available at the time you plan on going</w:t>
       </w:r>
       <w:r>
         <w:rPr>
@@ -2166,6 +2566,7 @@
         </w:rPr>
         <w:t xml:space="preserve">{%p </w:t>
       </w:r>
+      <w:proofErr w:type="gramStart"/>
       <w:r>
         <w:rPr>
           <w:color w:val="222222"/>
@@ -2178,6 +2579,7 @@
         </w:rPr>
         <w:t>%}</w:t>
       </w:r>
+      <w:proofErr w:type="gramEnd"/>
     </w:p>
     <w:p>
       <w:pPr>
@@ -2233,8 +2635,16 @@
         <w:rPr>
           <w:color w:val="222222"/>
         </w:rPr>
-        <w:t>{%p else %}</w:t>
-      </w:r>
+        <w:t xml:space="preserve">{%p </w:t>
+      </w:r>
+      <w:proofErr w:type="gramStart"/>
+      <w:r>
+        <w:rPr>
+          <w:color w:val="222222"/>
+        </w:rPr>
+        <w:t>else %}</w:t>
+      </w:r>
+      <w:proofErr w:type="gramEnd"/>
     </w:p>
     <w:p>
       <w:pPr>
@@ -2261,8 +2671,16 @@
         <w:rPr>
           <w:color w:val="222222"/>
         </w:rPr>
-        <w:t>{%p endif %}</w:t>
-      </w:r>
+        <w:t xml:space="preserve">{%p </w:t>
+      </w:r>
+      <w:proofErr w:type="gramStart"/>
+      <w:r>
+        <w:rPr>
+          <w:color w:val="222222"/>
+        </w:rPr>
+        <w:t>endif %}</w:t>
+      </w:r>
+      <w:proofErr w:type="gramEnd"/>
     </w:p>
     <w:p>
       <w:pPr>
@@ -2332,26 +2750,56 @@
           <w:b/>
           <w:color w:val="222222"/>
         </w:rPr>
-        <w:t xml:space="preserve"> copies</w:t>
-      </w:r>
-      <w:r>
-        <w:rPr>
-          <w:color w:val="222222"/>
-        </w:rPr>
-        <w:t>{% else %}</w:t>
-      </w:r>
+        <w:t xml:space="preserve"> </w:t>
+      </w:r>
+      <w:proofErr w:type="gramStart"/>
       <w:r>
         <w:rPr>
           <w:b/>
           <w:color w:val="222222"/>
         </w:rPr>
-        <w:t>3 copies</w:t>
-      </w:r>
-      <w:r>
-        <w:rPr>
-          <w:color w:val="222222"/>
-        </w:rPr>
-        <w:t>{% endif %}</w:t>
+        <w:t>copies</w:t>
+      </w:r>
+      <w:r>
+        <w:rPr>
+          <w:color w:val="222222"/>
+        </w:rPr>
+        <w:t>{</w:t>
+      </w:r>
+      <w:proofErr w:type="gramEnd"/>
+      <w:r>
+        <w:rPr>
+          <w:color w:val="222222"/>
+        </w:rPr>
+        <w:t>% else %}</w:t>
+      </w:r>
+      <w:r>
+        <w:rPr>
+          <w:b/>
+          <w:color w:val="222222"/>
+        </w:rPr>
+        <w:t xml:space="preserve">3 </w:t>
+      </w:r>
+      <w:proofErr w:type="gramStart"/>
+      <w:r>
+        <w:rPr>
+          <w:b/>
+          <w:color w:val="222222"/>
+        </w:rPr>
+        <w:t>copies</w:t>
+      </w:r>
+      <w:r>
+        <w:rPr>
+          <w:color w:val="222222"/>
+        </w:rPr>
+        <w:t>{</w:t>
+      </w:r>
+      <w:proofErr w:type="gramEnd"/>
+      <w:r>
+        <w:rPr>
+          <w:color w:val="222222"/>
+        </w:rPr>
+        <w:t>% endif %}</w:t>
       </w:r>
       <w:r>
         <w:rPr>
@@ -2484,6 +2932,101 @@
         <w:rPr>
           <w:color w:val="222222"/>
         </w:rPr>
+        <w:t>county_</w:t>
+      </w:r>
+      <w:proofErr w:type="gramStart"/>
+      <w:r>
+        <w:rPr>
+          <w:color w:val="222222"/>
+        </w:rPr>
+        <w:t>choice</w:t>
+      </w:r>
+      <w:proofErr w:type="spellEnd"/>
+      <w:r>
+        <w:rPr>
+          <w:color w:val="222222"/>
+        </w:rPr>
+        <w:t xml:space="preserve"> !</w:t>
+      </w:r>
+      <w:proofErr w:type="gramEnd"/>
+      <w:r>
+        <w:rPr>
+          <w:color w:val="222222"/>
+        </w:rPr>
+        <w:t>= “Oscoda” %}</w:t>
+      </w:r>
+    </w:p>
+    <w:p>
+      <w:pPr>
+        <w:spacing w:before="180" w:after="180"/>
+        <w:rPr>
+          <w:b/>
+          <w:color w:val="222222"/>
+        </w:rPr>
+      </w:pPr>
+      <w:r>
+        <w:rPr>
+          <w:b/>
+          <w:color w:val="222222"/>
+        </w:rPr>
+        <w:t>In some counties, the court clerk’s office will make the copies for you. You can call the clerk’s office ahead of time to ask if they can do this.</w:t>
+      </w:r>
+    </w:p>
+    <w:p>
+      <w:pPr>
+        <w:spacing w:before="180" w:after="180"/>
+        <w:rPr>
+          <w:color w:val="222222"/>
+        </w:rPr>
+      </w:pPr>
+      <w:r>
+        <w:rPr>
+          <w:color w:val="222222"/>
+        </w:rPr>
+        <w:t xml:space="preserve">{%p </w:t>
+      </w:r>
+      <w:proofErr w:type="gramStart"/>
+      <w:r>
+        <w:rPr>
+          <w:color w:val="222222"/>
+        </w:rPr>
+        <w:t>endif %}</w:t>
+      </w:r>
+      <w:proofErr w:type="gramEnd"/>
+    </w:p>
+    <w:p>
+      <w:pPr>
+        <w:spacing w:before="180" w:after="180"/>
+        <w:rPr>
+          <w:color w:val="222222"/>
+        </w:rPr>
+      </w:pPr>
+      <w:r>
+        <w:rPr>
+          <w:color w:val="222222"/>
+        </w:rPr>
+        <w:t xml:space="preserve">The original of each document gets filed with the court. Copies of the documents are for each of the following: Plaintiff (you), Defendant (your spouse), and </w:t>
+      </w:r>
+      <w:r>
+        <w:t>the Friend of the Court</w:t>
+      </w:r>
+      <w:r>
+        <w:rPr>
+          <w:color w:val="222222"/>
+        </w:rPr>
+        <w:t>.</w:t>
+      </w:r>
+      <w:r>
+        <w:rPr>
+          <w:color w:val="222222"/>
+        </w:rPr>
+        <w:t xml:space="preserve"> {%if </w:t>
+      </w:r>
+      <w:proofErr w:type="spellStart"/>
+      <w:r>
+        <w:rPr>
+          <w:color w:val="222222"/>
+        </w:rPr>
         <w:t>county_choice</w:t>
       </w:r>
       <w:proofErr w:type="spellEnd"/>
@@ -2491,66 +3034,73 @@
         <w:rPr>
           <w:color w:val="222222"/>
         </w:rPr>
-        <w:t xml:space="preserve"> != “Oscoda” %}</w:t>
-      </w:r>
-    </w:p>
-    <w:p>
-      <w:pPr>
-        <w:spacing w:before="180" w:after="180"/>
+        <w:t xml:space="preserve"> == “Oscoda” %}The Prosecuting Attorney also gets one copy of the Summons, but does not get any of the other documents.{% else %}</w:t>
+      </w:r>
+      <w:r>
         <w:rPr>
           <w:b/>
           <w:color w:val="222222"/>
         </w:rPr>
-      </w:pPr>
+        <w:t xml:space="preserve">If you are filing either by e-mail or using </w:t>
+      </w:r>
+      <w:proofErr w:type="spellStart"/>
       <w:r>
         <w:rPr>
           <w:b/>
           <w:color w:val="222222"/>
         </w:rPr>
-        <w:t>In some counties, the court clerk’s office will make the copies for you. You can call the clerk’s office ahead of time to ask if they can do this.</w:t>
-      </w:r>
-    </w:p>
-    <w:p>
-      <w:pPr>
-        <w:spacing w:before="180" w:after="180"/>
-        <w:rPr>
-          <w:color w:val="222222"/>
-        </w:rPr>
-      </w:pPr>
-      <w:r>
-        <w:rPr>
-          <w:color w:val="222222"/>
-        </w:rPr>
-        <w:t>{%p endif %}</w:t>
-      </w:r>
-    </w:p>
-    <w:p>
-      <w:pPr>
-        <w:spacing w:before="180" w:after="180"/>
-        <w:rPr>
-          <w:color w:val="222222"/>
-        </w:rPr>
-      </w:pPr>
-      <w:r>
-        <w:rPr>
-          <w:color w:val="222222"/>
-        </w:rPr>
-        <w:t xml:space="preserve">The original of each document gets filed with the court. Copies of the documents are for each of the following: Plaintiff (you), Defendant (your spouse), and </w:t>
-      </w:r>
-      <w:r>
-        <w:t>the Friend of the Court</w:t>
-      </w:r>
-      <w:r>
-        <w:rPr>
-          <w:color w:val="222222"/>
-        </w:rPr>
-        <w:t>.</w:t>
-      </w:r>
-      <w:r>
-        <w:rPr>
-          <w:color w:val="222222"/>
-        </w:rPr>
-        <w:t xml:space="preserve"> {%if </w:t>
+        <w:t>MiFILE</w:t>
+      </w:r>
+      <w:proofErr w:type="spellEnd"/>
+      <w:r>
+        <w:rPr>
+          <w:b/>
+          <w:color w:val="222222"/>
+        </w:rPr>
+        <w:t xml:space="preserve">, you will not need to file an extra copy for the Friend of the Court. You will only need to make copies for yourself and the other </w:t>
+      </w:r>
+      <w:proofErr w:type="gramStart"/>
+      <w:r>
+        <w:rPr>
+          <w:b/>
+          <w:color w:val="222222"/>
+        </w:rPr>
+        <w:t>party.</w:t>
+      </w:r>
+      <w:r>
+        <w:rPr>
+          <w:color w:val="222222"/>
+        </w:rPr>
+        <w:t>{</w:t>
+      </w:r>
+      <w:proofErr w:type="gramEnd"/>
+      <w:r>
+        <w:rPr>
+          <w:color w:val="222222"/>
+        </w:rPr>
+        <w:t xml:space="preserve">% </w:t>
+      </w:r>
+      <w:proofErr w:type="gramStart"/>
+      <w:r>
+        <w:rPr>
+          <w:color w:val="222222"/>
+        </w:rPr>
+        <w:t>endif %}</w:t>
+      </w:r>
+      <w:proofErr w:type="gramEnd"/>
+    </w:p>
+    <w:p>
+      <w:pPr>
+        <w:spacing w:before="180" w:after="180"/>
+        <w:rPr>
+          <w:color w:val="222222"/>
+        </w:rPr>
+      </w:pPr>
+      <w:r>
+        <w:rPr>
+          <w:color w:val="222222"/>
+        </w:rPr>
+        <w:t xml:space="preserve">{%p if </w:t>
       </w:r>
       <w:proofErr w:type="spellStart"/>
       <w:r>
@@ -2564,108 +3114,67 @@
         <w:rPr>
           <w:color w:val="222222"/>
         </w:rPr>
-        <w:t xml:space="preserve"> == “Oscoda” %}The Prosecuting Attorney also gets one copy of the Summons, but does not get any of the other documents.{% else %}</w:t>
-      </w:r>
-      <w:r>
+        <w:t xml:space="preserve"> == “Oscoda” %}</w:t>
+      </w:r>
+    </w:p>
+    <w:p>
+      <w:pPr>
+        <w:spacing w:before="180" w:after="180"/>
+        <w:rPr>
+          <w:color w:val="222222"/>
+        </w:rPr>
+      </w:pPr>
+      <w:r>
+        <w:rPr>
+          <w:color w:val="222222"/>
+        </w:rPr>
+        <w:t>At the top of one copy of each document write, “Friend of the Court.” At the top of one copy of the Summons and Complaint, write “Prosecuting Attorney.”</w:t>
+      </w:r>
+    </w:p>
+    <w:p>
+      <w:pPr>
+        <w:spacing w:before="180" w:after="180"/>
+        <w:rPr>
+          <w:color w:val="222222"/>
+        </w:rPr>
+      </w:pPr>
+      <w:r>
+        <w:rPr>
+          <w:color w:val="222222"/>
+        </w:rPr>
+        <w:t xml:space="preserve">{%p </w:t>
+      </w:r>
+      <w:proofErr w:type="gramStart"/>
+      <w:r>
+        <w:rPr>
+          <w:color w:val="222222"/>
+        </w:rPr>
+        <w:t>endif %}</w:t>
+      </w:r>
+      <w:proofErr w:type="gramEnd"/>
+    </w:p>
+    <w:p>
+      <w:pPr>
+        <w:spacing w:before="180" w:after="180"/>
         <w:rPr>
           <w:b/>
           <w:color w:val="222222"/>
         </w:rPr>
-        <w:t xml:space="preserve">If you are filing either by e-mail or using </w:t>
-      </w:r>
-      <w:proofErr w:type="spellStart"/>
-      <w:r>
-        <w:rPr>
-          <w:b/>
-          <w:color w:val="222222"/>
-        </w:rPr>
-        <w:t>MiFILE</w:t>
-      </w:r>
-      <w:proofErr w:type="spellEnd"/>
-      <w:r>
-        <w:rPr>
-          <w:b/>
-          <w:color w:val="222222"/>
-        </w:rPr>
-        <w:t>, you will not need to file an extra copy for the Friend of the Court. You will only need to make copies for yourself and the other party.</w:t>
-      </w:r>
-      <w:r>
-        <w:rPr>
-          <w:color w:val="222222"/>
-        </w:rPr>
-        <w:t>{% endif %}</w:t>
-      </w:r>
-    </w:p>
-    <w:p>
-      <w:pPr>
-        <w:spacing w:before="180" w:after="180"/>
-        <w:rPr>
-          <w:color w:val="222222"/>
-        </w:rPr>
-      </w:pPr>
-      <w:r>
-        <w:rPr>
-          <w:color w:val="222222"/>
-        </w:rPr>
-        <w:t xml:space="preserve">{%p if </w:t>
-      </w:r>
-      <w:proofErr w:type="spellStart"/>
-      <w:r>
-        <w:rPr>
-          <w:color w:val="222222"/>
-        </w:rPr>
-        <w:t>county_choice</w:t>
-      </w:r>
-      <w:proofErr w:type="spellEnd"/>
-      <w:r>
-        <w:rPr>
-          <w:color w:val="222222"/>
-        </w:rPr>
-        <w:t xml:space="preserve"> == “Oscoda” %}</w:t>
-      </w:r>
-    </w:p>
-    <w:p>
-      <w:pPr>
-        <w:spacing w:before="180" w:after="180"/>
-        <w:rPr>
-          <w:color w:val="222222"/>
-        </w:rPr>
-      </w:pPr>
-      <w:r>
-        <w:rPr>
-          <w:color w:val="222222"/>
-        </w:rPr>
-        <w:t>At the top of one copy of each document write, “Friend of the Court.” At the top of one copy of the Summons and Complaint, write “Prosecuting Attorney.”</w:t>
-      </w:r>
-    </w:p>
-    <w:p>
-      <w:pPr>
-        <w:spacing w:before="180" w:after="180"/>
-        <w:rPr>
-          <w:color w:val="222222"/>
-        </w:rPr>
-      </w:pPr>
-      <w:r>
-        <w:rPr>
-          <w:color w:val="222222"/>
-        </w:rPr>
-        <w:t>{%p endif %}</w:t>
-      </w:r>
-    </w:p>
-    <w:p>
-      <w:pPr>
-        <w:spacing w:before="180" w:after="180"/>
-        <w:rPr>
-          <w:b/>
-          <w:color w:val="222222"/>
-        </w:rPr>
-      </w:pPr>
-      <w:r>
-        <w:rPr>
-          <w:color w:val="222222"/>
-        </w:rPr>
-        <w:t>{%p endif %}</w:t>
-      </w:r>
+      </w:pPr>
+      <w:r>
+        <w:rPr>
+          <w:color w:val="222222"/>
+        </w:rPr>
+        <w:t xml:space="preserve">{%p </w:t>
+      </w:r>
+      <w:proofErr w:type="gramStart"/>
+      <w:r>
+        <w:rPr>
+          <w:color w:val="222222"/>
+        </w:rPr>
+        <w:t>endif %}</w:t>
+      </w:r>
+      <w:proofErr w:type="gramEnd"/>
       <w:r>
         <w:rPr>
           <w:color w:val="222222"/>
@@ -2735,7 +3244,21 @@
         <w:rPr>
           <w:color w:val="222222"/>
         </w:rPr>
-        <w:t>Complaint for Divorce (original)</w:t>
+        <w:t xml:space="preserve">Complaint </w:t>
+      </w:r>
+      <w:proofErr w:type="gramStart"/>
+      <w:r>
+        <w:rPr>
+          <w:color w:val="222222"/>
+        </w:rPr>
+        <w:t>for</w:t>
+      </w:r>
+      <w:proofErr w:type="gramEnd"/>
+      <w:r>
+        <w:rPr>
+          <w:color w:val="222222"/>
+        </w:rPr>
+        <w:t xml:space="preserve"> Divorce (original)</w:t>
       </w:r>
     </w:p>
     <w:p>
@@ -3110,7 +3633,21 @@
         <w:rPr>
           <w:color w:val="222222"/>
         </w:rPr>
-        <w:t>Parties and/or attorneys must be in line no later than 3:30 p.m. in order to obtain service that day.</w:t>
+        <w:t xml:space="preserve">Parties and/or attorneys must be in line no later than 3:30 p.m. </w:t>
+      </w:r>
+      <w:proofErr w:type="gramStart"/>
+      <w:r>
+        <w:rPr>
+          <w:color w:val="222222"/>
+        </w:rPr>
+        <w:t>in order to</w:t>
+      </w:r>
+      <w:proofErr w:type="gramEnd"/>
+      <w:r>
+        <w:rPr>
+          <w:color w:val="222222"/>
+        </w:rPr>
+        <w:t xml:space="preserve"> obtain service that day.</w:t>
       </w:r>
     </w:p>
     <w:p>
@@ -3202,7 +3739,21 @@
         <w:rPr>
           <w:color w:val="222222"/>
         </w:rPr>
-        <w:t>The clerk will stamp and file your Complaint for Divorce. You will get a case number and your case will be assigned to a judge at this time.</w:t>
+        <w:t xml:space="preserve">The clerk will stamp and file your Complaint for Divorce. You will get a case </w:t>
+      </w:r>
+      <w:proofErr w:type="gramStart"/>
+      <w:r>
+        <w:rPr>
+          <w:color w:val="222222"/>
+        </w:rPr>
+        <w:t>number</w:t>
+      </w:r>
+      <w:proofErr w:type="gramEnd"/>
+      <w:r>
+        <w:rPr>
+          <w:color w:val="222222"/>
+        </w:rPr>
+        <w:t xml:space="preserve"> and your case will be assigned to a judge at this time.</w:t>
       </w:r>
     </w:p>
     <w:p>
@@ -3219,7 +3770,15 @@
         <w:t xml:space="preserve">If you are filing in person, the clerk will </w:t>
       </w:r>
       <w:r>
-        <w:t xml:space="preserve">print a Summons </w:t>
+        <w:t xml:space="preserve">print </w:t>
+      </w:r>
+      <w:proofErr w:type="gramStart"/>
+      <w:r>
+        <w:t>a Summons</w:t>
+      </w:r>
+      <w:proofErr w:type="gramEnd"/>
+      <w:r>
+        <w:t xml:space="preserve"> </w:t>
       </w:r>
       <w:r>
         <w:rPr>
@@ -3322,7 +3881,21 @@
         <w:rPr>
           <w:color w:val="222222"/>
         </w:rPr>
-        <w:t xml:space="preserve">{%p else %} </w:t>
+        <w:t xml:space="preserve">{%p </w:t>
+      </w:r>
+      <w:proofErr w:type="gramStart"/>
+      <w:r>
+        <w:rPr>
+          <w:color w:val="222222"/>
+        </w:rPr>
+        <w:t>else %}</w:t>
+      </w:r>
+      <w:proofErr w:type="gramEnd"/>
+      <w:r>
+        <w:rPr>
+          <w:color w:val="222222"/>
+        </w:rPr>
+        <w:t xml:space="preserve"> </w:t>
       </w:r>
       <w:r>
         <w:rPr>
@@ -3434,7 +4007,23 @@
           <w:b/>
           <w:color w:val="222222"/>
         </w:rPr>
-        <w:t>, you will need to choose a drop down label for each individual document you upload. Choose "NEW CASE FILING FEE</w:t>
+        <w:t xml:space="preserve">, you will need to choose a </w:t>
+      </w:r>
+      <w:proofErr w:type="gramStart"/>
+      <w:r>
+        <w:rPr>
+          <w:b/>
+          <w:color w:val="222222"/>
+        </w:rPr>
+        <w:t>drop down</w:t>
+      </w:r>
+      <w:proofErr w:type="gramEnd"/>
+      <w:r>
+        <w:rPr>
+          <w:b/>
+          <w:color w:val="222222"/>
+        </w:rPr>
+        <w:t xml:space="preserve"> label for each individual document you upload. Choose "NEW CASE FILING FEE</w:t>
       </w:r>
       <w:r>
         <w:rPr>
@@ -3653,8 +4242,16 @@
         <w:rPr>
           <w:color w:val="222222"/>
         </w:rPr>
-        <w:t>{%p endif %}</w:t>
-      </w:r>
+        <w:t xml:space="preserve">{%p </w:t>
+      </w:r>
+      <w:proofErr w:type="gramStart"/>
+      <w:r>
+        <w:rPr>
+          <w:color w:val="222222"/>
+        </w:rPr>
+        <w:t>endif %}</w:t>
+      </w:r>
+      <w:proofErr w:type="gramEnd"/>
     </w:p>
     <w:p>
       <w:pPr>
@@ -3797,7 +4394,15 @@
           <w:color w:val="222222"/>
           <w:highlight w:val="white"/>
         </w:rPr>
-        <w:t>county_choice</w:t>
+        <w:t>county_</w:t>
+      </w:r>
+      <w:proofErr w:type="gramStart"/>
+      <w:r>
+        <w:rPr>
+          <w:color w:val="222222"/>
+          <w:highlight w:val="white"/>
+        </w:rPr>
+        <w:t>choice</w:t>
       </w:r>
       <w:proofErr w:type="spellEnd"/>
       <w:r>
@@ -3805,7 +4410,15 @@
           <w:color w:val="222222"/>
           <w:highlight w:val="white"/>
         </w:rPr>
-        <w:t xml:space="preserve"> != “Oakland” %}</w:t>
+        <w:t xml:space="preserve"> !</w:t>
+      </w:r>
+      <w:proofErr w:type="gramEnd"/>
+      <w:r>
+        <w:rPr>
+          <w:color w:val="222222"/>
+          <w:highlight w:val="white"/>
+        </w:rPr>
+        <w:t>= “Oakland” %}</w:t>
       </w:r>
     </w:p>
     <w:p>
@@ -3851,8 +4464,16 @@
         <w:rPr>
           <w:color w:val="222222"/>
         </w:rPr>
-        <w:t>{%p endif %}</w:t>
-      </w:r>
+        <w:t xml:space="preserve">{%p </w:t>
+      </w:r>
+      <w:proofErr w:type="gramStart"/>
+      <w:r>
+        <w:rPr>
+          <w:color w:val="222222"/>
+        </w:rPr>
+        <w:t>endif %}</w:t>
+      </w:r>
+      <w:proofErr w:type="gramEnd"/>
     </w:p>
     <w:p>
       <w:pPr>
@@ -3880,7 +4501,21 @@
         <w:rPr>
           <w:color w:val="222222"/>
         </w:rPr>
-        <w:t>. There is also an $80 judgment fee due at the time of filing. There may be more costs, such as charges for having papers served on your child’s other parent, motion filing fees, and costs for alternative dispute resolution services (mediation).</w:t>
+        <w:t xml:space="preserve">. There is also an $80 judgment fee due at the time of filing. There may be more costs, such as charges for having papers served on your child’s other </w:t>
+      </w:r>
+      <w:proofErr w:type="gramStart"/>
+      <w:r>
+        <w:rPr>
+          <w:color w:val="222222"/>
+        </w:rPr>
+        <w:t>parent</w:t>
+      </w:r>
+      <w:proofErr w:type="gramEnd"/>
+      <w:r>
+        <w:rPr>
+          <w:color w:val="222222"/>
+        </w:rPr>
+        <w:t>, motion filing fees, and costs for alternative dispute resolution services (mediation).</w:t>
       </w:r>
     </w:p>
     <w:p>
@@ -3936,21 +4571,43 @@
         <w:rPr>
           <w:color w:val="222222"/>
         </w:rPr>
-        <w:t>{%p else %}</w:t>
-      </w:r>
-    </w:p>
-    <w:p>
-      <w:pPr>
-        <w:spacing w:before="180" w:after="180"/>
-        <w:rPr>
-          <w:color w:val="222222"/>
-        </w:rPr>
-      </w:pPr>
-      <w:r>
-        <w:rPr>
-          <w:color w:val="222222"/>
-        </w:rPr>
-        <w:t>Pay the filing fee or file a Fee Waiver Request along with the following documents:</w:t>
+        <w:t xml:space="preserve">{%p </w:t>
+      </w:r>
+      <w:proofErr w:type="gramStart"/>
+      <w:r>
+        <w:rPr>
+          <w:color w:val="222222"/>
+        </w:rPr>
+        <w:t>else %}</w:t>
+      </w:r>
+      <w:proofErr w:type="gramEnd"/>
+    </w:p>
+    <w:p>
+      <w:pPr>
+        <w:spacing w:before="180" w:after="180"/>
+        <w:rPr>
+          <w:color w:val="222222"/>
+        </w:rPr>
+      </w:pPr>
+      <w:r>
+        <w:rPr>
+          <w:color w:val="222222"/>
+        </w:rPr>
+        <w:t xml:space="preserve">Pay </w:t>
+      </w:r>
+      <w:proofErr w:type="gramStart"/>
+      <w:r>
+        <w:rPr>
+          <w:color w:val="222222"/>
+        </w:rPr>
+        <w:t>the filing</w:t>
+      </w:r>
+      <w:proofErr w:type="gramEnd"/>
+      <w:r>
+        <w:rPr>
+          <w:color w:val="222222"/>
+        </w:rPr>
+        <w:t xml:space="preserve"> fee or file a Fee Waiver Request along with the following documents:</w:t>
       </w:r>
     </w:p>
     <w:p>
@@ -3965,8 +4622,16 @@
           <w:color w:val="222222"/>
         </w:rPr>
         <w:lastRenderedPageBreak/>
-        <w:t>{%p endif %}</w:t>
-      </w:r>
+        <w:t xml:space="preserve">{%p </w:t>
+      </w:r>
+      <w:proofErr w:type="gramStart"/>
+      <w:r>
+        <w:rPr>
+          <w:color w:val="222222"/>
+        </w:rPr>
+        <w:t>endif %}</w:t>
+      </w:r>
+      <w:proofErr w:type="gramEnd"/>
     </w:p>
     <w:p>
       <w:pPr>
@@ -3998,7 +4663,21 @@
         <w:rPr>
           <w:color w:val="222222"/>
         </w:rPr>
-        <w:t>Complaint for Divorce with Children</w:t>
+        <w:t xml:space="preserve">Complaint </w:t>
+      </w:r>
+      <w:proofErr w:type="gramStart"/>
+      <w:r>
+        <w:rPr>
+          <w:color w:val="222222"/>
+        </w:rPr>
+        <w:t>for</w:t>
+      </w:r>
+      <w:proofErr w:type="gramEnd"/>
+      <w:r>
+        <w:rPr>
+          <w:color w:val="222222"/>
+        </w:rPr>
+        <w:t xml:space="preserve"> Divorce with Children</w:t>
       </w:r>
     </w:p>
     <w:p>
@@ -4103,12 +4782,87 @@
           <w:numId w:val="3"/>
         </w:numPr>
         <w:spacing w:after="0"/>
-      </w:pPr>
-      <w:r>
-        <w:rPr>
-          <w:color w:val="222222"/>
-        </w:rPr>
-        <w:t>Case Initiation Information</w:t>
+        <w:rPr>
+          <w:color w:val="1155CC"/>
+          <w:highlight w:val="white"/>
+          <w:u w:val="single"/>
+        </w:rPr>
+      </w:pPr>
+      <w:hyperlink r:id="rId39" w:history="1">
+        <w:r>
+          <w:rPr>
+            <w:color w:val="1155CC"/>
+            <w:highlight w:val="white"/>
+            <w:u w:val="single"/>
+          </w:rPr>
+          <w:t>Case Initiation Informati</w:t>
+        </w:r>
+        <w:r>
+          <w:rPr>
+            <w:color w:val="1155CC"/>
+            <w:highlight w:val="white"/>
+            <w:u w:val="single"/>
+          </w:rPr>
+          <w:t>o</w:t>
+        </w:r>
+        <w:r>
+          <w:rPr>
+            <w:color w:val="1155CC"/>
+            <w:highlight w:val="white"/>
+            <w:u w:val="single"/>
+          </w:rPr>
+          <w:t>n Form</w:t>
+        </w:r>
+      </w:hyperlink>
+      <w:r>
+        <w:rPr>
+          <w:color w:val="222222"/>
+        </w:rPr>
+        <w:t xml:space="preserve"> </w:t>
+      </w:r>
+      <w:r>
+        <w:rPr>
+          <w:color w:val="222222"/>
+        </w:rPr>
+        <w:t>(</w:t>
+      </w:r>
+      <w:r>
+        <w:rPr>
+          <w:color w:val="222222"/>
+        </w:rPr>
+        <w:t xml:space="preserve">linked </w:t>
+      </w:r>
+      <w:proofErr w:type="gramStart"/>
+      <w:r>
+        <w:rPr>
+          <w:color w:val="222222"/>
+        </w:rPr>
+        <w:t>and also</w:t>
+      </w:r>
+      <w:proofErr w:type="gramEnd"/>
+      <w:r>
+        <w:rPr>
+          <w:color w:val="222222"/>
+        </w:rPr>
+        <w:t xml:space="preserve"> a</w:t>
+      </w:r>
+      <w:r>
+        <w:rPr>
+          <w:color w:val="222222"/>
+        </w:rPr>
+        <w:t>vailable from the</w:t>
+      </w:r>
+      <w:r>
+        <w:rPr>
+          <w:color w:val="222222"/>
+        </w:rPr>
+        <w:t xml:space="preserve"> court</w:t>
+      </w:r>
+      <w:r>
+        <w:rPr>
+          <w:color w:val="222222"/>
+        </w:rPr>
+        <w:t xml:space="preserve"> clerk)</w:t>
       </w:r>
     </w:p>
     <w:p>
@@ -4123,8 +4877,16 @@
         <w:rPr>
           <w:color w:val="222222"/>
         </w:rPr>
-        <w:t>{%p endif %}</w:t>
-      </w:r>
+        <w:t xml:space="preserve">{%p </w:t>
+      </w:r>
+      <w:proofErr w:type="gramStart"/>
+      <w:r>
+        <w:rPr>
+          <w:color w:val="222222"/>
+        </w:rPr>
+        <w:t>endif %}</w:t>
+      </w:r>
+      <w:proofErr w:type="gramEnd"/>
     </w:p>
     <w:p>
       <w:pPr>
@@ -4187,13 +4949,27 @@
         <w:rPr>
           <w:color w:val="222222"/>
         </w:rPr>
-        <w:t>Record of Divorce or Annulment</w:t>
-      </w:r>
-      <w:r>
-        <w:rPr>
-          <w:color w:val="222222"/>
-        </w:rPr>
-        <w:t xml:space="preserve">{% if </w:t>
+        <w:t xml:space="preserve">Record of Divorce or </w:t>
+      </w:r>
+      <w:proofErr w:type="gramStart"/>
+      <w:r>
+        <w:rPr>
+          <w:color w:val="222222"/>
+        </w:rPr>
+        <w:t>Annulment</w:t>
+      </w:r>
+      <w:r>
+        <w:rPr>
+          <w:color w:val="222222"/>
+        </w:rPr>
+        <w:t>{</w:t>
+      </w:r>
+      <w:proofErr w:type="gramEnd"/>
+      <w:r>
+        <w:rPr>
+          <w:color w:val="222222"/>
+        </w:rPr>
+        <w:t xml:space="preserve">% if </w:t>
       </w:r>
       <w:proofErr w:type="spellStart"/>
       <w:r>
@@ -4233,7 +5009,21 @@
         <w:rPr>
           <w:color w:val="222222"/>
         </w:rPr>
-        <w:t>” %} (depending on your county){% endif %}</w:t>
+        <w:t xml:space="preserve">” %} (depending on your </w:t>
+      </w:r>
+      <w:proofErr w:type="gramStart"/>
+      <w:r>
+        <w:rPr>
+          <w:color w:val="222222"/>
+        </w:rPr>
+        <w:t>county){</w:t>
+      </w:r>
+      <w:proofErr w:type="gramEnd"/>
+      <w:r>
+        <w:rPr>
+          <w:color w:val="222222"/>
+        </w:rPr>
+        <w:t>% endif %}</w:t>
       </w:r>
     </w:p>
     <w:p>
@@ -4248,8 +5038,16 @@
         <w:rPr>
           <w:color w:val="222222"/>
         </w:rPr>
-        <w:t>{%p endif %}</w:t>
-      </w:r>
+        <w:t xml:space="preserve">{%p </w:t>
+      </w:r>
+      <w:proofErr w:type="gramStart"/>
+      <w:r>
+        <w:rPr>
+          <w:color w:val="222222"/>
+        </w:rPr>
+        <w:t>endif %}</w:t>
+      </w:r>
+      <w:proofErr w:type="gramEnd"/>
     </w:p>
     <w:p>
       <w:pPr>
@@ -4307,8 +5105,16 @@
         <w:rPr>
           <w:color w:val="222222"/>
         </w:rPr>
-        <w:t>{%p endif %}</w:t>
-      </w:r>
+        <w:t xml:space="preserve">{%p </w:t>
+      </w:r>
+      <w:proofErr w:type="gramStart"/>
+      <w:r>
+        <w:rPr>
+          <w:color w:val="222222"/>
+        </w:rPr>
+        <w:t>endif %}</w:t>
+      </w:r>
+      <w:proofErr w:type="gramEnd"/>
     </w:p>
     <w:p>
       <w:pPr>
@@ -4357,7 +5163,21 @@
         <w:rPr>
           <w:color w:val="222222"/>
         </w:rPr>
-        <w:t xml:space="preserve"> on Friend of the Court and Prosecuting Attorney (Form OCDR 80): This is a local form used by the Oscoda County Circuit Court. You must complete it and file it with your other documents to show that you filed a Friend of the Court copy of each of your documents, and a Prosecuting Attorney’s copy of the Summons and Complaint. You can get this form from the court clerk’s office or from the Michigan Legal Help Self-Help Center of Oscoda County. The Self-Help Center is located in the Oscoda County Public Library.</w:t>
+        <w:t xml:space="preserve"> on Friend of the Court and Prosecuting Attorney (Form OCDR 80): This is a local form used by the Oscoda County Circuit Court. You must complete it and file it with your other documents to show that you filed a Friend of the Court copy of each of your documents, and a Prosecuting Attorney’s copy of the Summons and Complaint. You can get this form from the court clerk’s office or from the Michigan Legal Help Self-Help Center of Oscoda County. The Self-Help Center </w:t>
+      </w:r>
+      <w:proofErr w:type="gramStart"/>
+      <w:r>
+        <w:rPr>
+          <w:color w:val="222222"/>
+        </w:rPr>
+        <w:t>is located in</w:t>
+      </w:r>
+      <w:proofErr w:type="gramEnd"/>
+      <w:r>
+        <w:rPr>
+          <w:color w:val="222222"/>
+        </w:rPr>
+        <w:t xml:space="preserve"> the Oscoda County Public Library.</w:t>
       </w:r>
     </w:p>
     <w:p>
@@ -4372,8 +5192,16 @@
         <w:rPr>
           <w:color w:val="222222"/>
         </w:rPr>
-        <w:t>{%p endif %}</w:t>
-      </w:r>
+        <w:t xml:space="preserve">{%p </w:t>
+      </w:r>
+      <w:proofErr w:type="gramStart"/>
+      <w:r>
+        <w:rPr>
+          <w:color w:val="222222"/>
+        </w:rPr>
+        <w:t>endif %}</w:t>
+      </w:r>
+      <w:proofErr w:type="gramEnd"/>
     </w:p>
     <w:p>
       <w:pPr>
@@ -4433,281 +5261,480 @@
           <w:color w:val="222222"/>
           <w:highlight w:val="white"/>
         </w:rPr>
+        <w:t xml:space="preserve">” </w:t>
+      </w:r>
+      <w:proofErr w:type="gramStart"/>
+      <w:r>
+        <w:rPr>
+          <w:color w:val="222222"/>
+          <w:highlight w:val="white"/>
+        </w:rPr>
+        <w:t>%}</w:t>
+      </w:r>
+      <w:r>
+        <w:rPr>
+          <w:color w:val="222222"/>
+        </w:rPr>
+        <w:t>Give</w:t>
+      </w:r>
+      <w:proofErr w:type="gramEnd"/>
+      <w:r>
+        <w:rPr>
+          <w:color w:val="222222"/>
+        </w:rPr>
+        <w:t xml:space="preserve"> the clerk </w:t>
+      </w:r>
+      <w:proofErr w:type="gramStart"/>
+      <w:r>
+        <w:rPr>
+          <w:color w:val="222222"/>
+        </w:rPr>
+        <w:t>all of</w:t>
+      </w:r>
+      <w:proofErr w:type="gramEnd"/>
+      <w:r>
+        <w:rPr>
+          <w:color w:val="222222"/>
+        </w:rPr>
+        <w:t xml:space="preserve"> the originals and </w:t>
+      </w:r>
+      <w:proofErr w:type="gramStart"/>
+      <w:r>
+        <w:rPr>
+          <w:color w:val="222222"/>
+        </w:rPr>
+        <w:t>all of</w:t>
+      </w:r>
+      <w:proofErr w:type="gramEnd"/>
+      <w:r>
+        <w:rPr>
+          <w:color w:val="222222"/>
+        </w:rPr>
+        <w:t xml:space="preserve"> the copies. {% </w:t>
+      </w:r>
+      <w:proofErr w:type="spellStart"/>
+      <w:r>
+        <w:rPr>
+          <w:color w:val="222222"/>
+        </w:rPr>
+        <w:t>elif</w:t>
+      </w:r>
+      <w:proofErr w:type="spellEnd"/>
+      <w:r>
+        <w:rPr>
+          <w:color w:val="222222"/>
+        </w:rPr>
+        <w:t xml:space="preserve"> </w:t>
+      </w:r>
+      <w:proofErr w:type="spellStart"/>
+      <w:r>
+        <w:rPr>
+          <w:color w:val="222222"/>
+        </w:rPr>
+        <w:t>county_</w:t>
+      </w:r>
+      <w:proofErr w:type="gramStart"/>
+      <w:r>
+        <w:rPr>
+          <w:color w:val="222222"/>
+        </w:rPr>
+        <w:t>choice</w:t>
+      </w:r>
+      <w:proofErr w:type="spellEnd"/>
+      <w:r>
+        <w:rPr>
+          <w:color w:val="222222"/>
+        </w:rPr>
+        <w:t xml:space="preserve"> !</w:t>
+      </w:r>
+      <w:proofErr w:type="gramEnd"/>
+      <w:r>
+        <w:rPr>
+          <w:color w:val="222222"/>
+        </w:rPr>
+        <w:t>= “</w:t>
+      </w:r>
+      <w:r>
+        <w:rPr>
+          <w:color w:val="222222"/>
+        </w:rPr>
+        <w:t>Oakland</w:t>
+      </w:r>
+      <w:r>
+        <w:rPr>
+          <w:color w:val="222222"/>
+        </w:rPr>
+        <w:t xml:space="preserve">” </w:t>
+      </w:r>
+      <w:proofErr w:type="gramStart"/>
+      <w:r>
+        <w:rPr>
+          <w:color w:val="222222"/>
+        </w:rPr>
+        <w:t>%}If</w:t>
+      </w:r>
+      <w:proofErr w:type="gramEnd"/>
+      <w:r>
+        <w:rPr>
+          <w:color w:val="222222"/>
+        </w:rPr>
+        <w:t xml:space="preserve"> you are filing in person at the court clerk's office, give the clerk </w:t>
+      </w:r>
+      <w:proofErr w:type="gramStart"/>
+      <w:r>
+        <w:rPr>
+          <w:color w:val="222222"/>
+        </w:rPr>
+        <w:t>all of</w:t>
+      </w:r>
+      <w:proofErr w:type="gramEnd"/>
+      <w:r>
+        <w:rPr>
+          <w:color w:val="222222"/>
+        </w:rPr>
+        <w:t xml:space="preserve"> the originals and </w:t>
+      </w:r>
+      <w:proofErr w:type="gramStart"/>
+      <w:r>
+        <w:rPr>
+          <w:color w:val="222222"/>
+        </w:rPr>
+        <w:t>all of</w:t>
+      </w:r>
+      <w:proofErr w:type="gramEnd"/>
+      <w:r>
+        <w:rPr>
+          <w:color w:val="222222"/>
+        </w:rPr>
+        <w:t xml:space="preserve"> the copies. {% endif </w:t>
+      </w:r>
+      <w:proofErr w:type="gramStart"/>
+      <w:r>
+        <w:rPr>
+          <w:color w:val="222222"/>
+        </w:rPr>
+        <w:t>%}</w:t>
+      </w:r>
+      <w:r>
+        <w:rPr>
+          <w:color w:val="222222"/>
+        </w:rPr>
+        <w:t>{</w:t>
+      </w:r>
+      <w:proofErr w:type="gramEnd"/>
+      <w:r>
+        <w:rPr>
+          <w:color w:val="222222"/>
+        </w:rPr>
+        <w:t xml:space="preserve">% if </w:t>
+      </w:r>
+      <w:proofErr w:type="spellStart"/>
+      <w:r>
+        <w:rPr>
+          <w:color w:val="222222"/>
+        </w:rPr>
+        <w:t>county_</w:t>
+      </w:r>
+      <w:proofErr w:type="gramStart"/>
+      <w:r>
+        <w:rPr>
+          <w:color w:val="222222"/>
+        </w:rPr>
+        <w:t>choice</w:t>
+      </w:r>
+      <w:proofErr w:type="spellEnd"/>
+      <w:r>
+        <w:rPr>
+          <w:color w:val="222222"/>
+        </w:rPr>
+        <w:t xml:space="preserve"> !</w:t>
+      </w:r>
+      <w:proofErr w:type="gramEnd"/>
+      <w:r>
+        <w:rPr>
+          <w:color w:val="222222"/>
+        </w:rPr>
+        <w:t>= “</w:t>
+      </w:r>
+      <w:r>
+        <w:rPr>
+          <w:color w:val="222222"/>
+        </w:rPr>
+        <w:t>Oakland</w:t>
+      </w:r>
+      <w:r>
+        <w:rPr>
+          <w:color w:val="222222"/>
+        </w:rPr>
+        <w:t xml:space="preserve">” </w:t>
+      </w:r>
+      <w:proofErr w:type="gramStart"/>
+      <w:r>
+        <w:rPr>
+          <w:color w:val="222222"/>
+        </w:rPr>
+        <w:t>%}</w:t>
+      </w:r>
+      <w:r>
+        <w:rPr>
+          <w:color w:val="222222"/>
+        </w:rPr>
+        <w:t>The</w:t>
+      </w:r>
+      <w:proofErr w:type="gramEnd"/>
+      <w:r>
+        <w:rPr>
+          <w:color w:val="222222"/>
+        </w:rPr>
+        <w:t xml:space="preserve"> clerk will assign a case number and a judge to your case and will stamp and sign the Summons. The clerk will return copies of all the divorce papers that the court doesn’t need.</w:t>
+      </w:r>
+      <w:r>
+        <w:rPr>
+          <w:color w:val="222222"/>
+        </w:rPr>
+        <w:t xml:space="preserve">{% if </w:t>
+      </w:r>
+      <w:proofErr w:type="spellStart"/>
+      <w:r>
+        <w:rPr>
+          <w:color w:val="222222"/>
+        </w:rPr>
+        <w:t>county_choice</w:t>
+      </w:r>
+      <w:proofErr w:type="spellEnd"/>
+      <w:r>
+        <w:rPr>
+          <w:color w:val="222222"/>
+        </w:rPr>
+        <w:t xml:space="preserve"> </w:t>
+      </w:r>
+      <w:r>
+        <w:rPr>
+          <w:color w:val="222222"/>
+        </w:rPr>
+        <w:t>not in</w:t>
+      </w:r>
+      <w:r>
+        <w:rPr>
+          <w:color w:val="222222"/>
+        </w:rPr>
+        <w:t xml:space="preserve"> “</w:t>
+      </w:r>
+      <w:proofErr w:type="spellStart"/>
+      <w:r>
+        <w:rPr>
+          <w:color w:val="222222"/>
+        </w:rPr>
+        <w:t>Allegan</w:t>
+      </w:r>
+      <w:r>
+        <w:rPr>
+          <w:color w:val="222222"/>
+        </w:rPr>
+        <w:t>|Ingham</w:t>
+      </w:r>
+      <w:r>
+        <w:rPr>
+          <w:color w:val="222222"/>
+        </w:rPr>
+        <w:t>|Lenawee</w:t>
+      </w:r>
+      <w:r>
+        <w:rPr>
+          <w:color w:val="222222"/>
+        </w:rPr>
+        <w:t>|Oscoda</w:t>
+      </w:r>
+      <w:r>
+        <w:rPr>
+          <w:color w:val="222222"/>
+        </w:rPr>
+        <w:t>|Ottawa</w:t>
+      </w:r>
+      <w:proofErr w:type="spellEnd"/>
+      <w:r>
+        <w:rPr>
+          <w:color w:val="222222"/>
+        </w:rPr>
         <w:t>” %}</w:t>
       </w:r>
       <w:r>
         <w:rPr>
           <w:color w:val="222222"/>
         </w:rPr>
-        <w:t xml:space="preserve">Give the clerk all of the originals and all of the copies. {% </w:t>
+        <w:t xml:space="preserve"> </w:t>
+      </w:r>
+      <w:r>
+        <w:rPr>
+          <w:color w:val="222222"/>
+        </w:rPr>
+        <w:t>If you are e-filing or email filing, upload PDFs of each form to the e-filing platfor</w:t>
+      </w:r>
+      <w:r>
+        <w:rPr>
+          <w:color w:val="222222"/>
+        </w:rPr>
+        <w:t>m or to an email and submit it.</w:t>
+      </w:r>
+      <w:r>
+        <w:rPr>
+          <w:color w:val="222222"/>
+        </w:rPr>
+        <w:t xml:space="preserve"> </w:t>
+      </w:r>
+      <w:r>
+        <w:rPr>
+          <w:color w:val="222222"/>
+        </w:rPr>
+        <w:t xml:space="preserve">{% endif </w:t>
+      </w:r>
+      <w:proofErr w:type="gramStart"/>
+      <w:r>
+        <w:rPr>
+          <w:color w:val="222222"/>
+        </w:rPr>
+        <w:t>%}{</w:t>
+      </w:r>
+      <w:proofErr w:type="gramEnd"/>
+      <w:r>
+        <w:rPr>
+          <w:color w:val="222222"/>
+        </w:rPr>
+        <w:t xml:space="preserve">% </w:t>
+      </w:r>
+      <w:proofErr w:type="gramStart"/>
+      <w:r>
+        <w:rPr>
+          <w:color w:val="222222"/>
+        </w:rPr>
+        <w:t>endif %}</w:t>
+      </w:r>
+      <w:proofErr w:type="gramEnd"/>
+    </w:p>
+    <w:p>
+      <w:pPr>
+        <w:spacing w:before="180" w:after="180"/>
+        <w:rPr>
+          <w:color w:val="222222"/>
+        </w:rPr>
+      </w:pPr>
+      <w:r>
+        <w:rPr>
+          <w:color w:val="222222"/>
+        </w:rPr>
+        <w:t xml:space="preserve">{%p if </w:t>
       </w:r>
       <w:proofErr w:type="spellStart"/>
       <w:r>
         <w:rPr>
           <w:color w:val="222222"/>
         </w:rPr>
-        <w:t>elif</w:t>
+        <w:t>county_choice</w:t>
       </w:r>
       <w:proofErr w:type="spellEnd"/>
       <w:r>
         <w:rPr>
           <w:color w:val="222222"/>
         </w:rPr>
+        <w:t xml:space="preserve"> == “Lenawee” %}</w:t>
+      </w:r>
+    </w:p>
+    <w:p>
+      <w:pPr>
+        <w:spacing w:before="180" w:after="180"/>
+        <w:rPr>
+          <w:color w:val="222222"/>
+        </w:rPr>
+      </w:pPr>
+      <w:r>
+        <w:rPr>
+          <w:color w:val="222222"/>
+        </w:rPr>
+        <w:t xml:space="preserve">The clerk will also give you a yellow form called Pre-Trial Notice &amp;/or Notice of Taking Judgment. </w:t>
+      </w:r>
+      <w:r>
+        <w:rPr>
+          <w:color w:val="222222"/>
+        </w:rPr>
+        <w:t xml:space="preserve">Serve this form on your </w:t>
+      </w:r>
+      <w:proofErr w:type="gramStart"/>
+      <w:r>
+        <w:rPr>
+          <w:color w:val="222222"/>
+        </w:rPr>
+        <w:t>spouse, and</w:t>
+      </w:r>
+      <w:proofErr w:type="gramEnd"/>
+      <w:r>
+        <w:rPr>
+          <w:color w:val="222222"/>
+        </w:rPr>
+        <w:t xml:space="preserve"> keep a copy for yourself. (Step 6).</w:t>
+      </w:r>
+    </w:p>
+    <w:p>
+      <w:pPr>
+        <w:spacing w:before="180" w:after="180"/>
+        <w:rPr>
+          <w:color w:val="222222"/>
+        </w:rPr>
+      </w:pPr>
+      <w:r>
+        <w:rPr>
+          <w:color w:val="222222"/>
+        </w:rPr>
+        <w:t>When you file your forms, you must also schedule a date for an intake meeting with the Friend of the Court (See step 8).</w:t>
+      </w:r>
+    </w:p>
+    <w:p>
+      <w:pPr>
+        <w:spacing w:before="180" w:after="180"/>
+        <w:rPr>
+          <w:color w:val="222222"/>
+        </w:rPr>
+      </w:pPr>
+      <w:r>
+        <w:rPr>
+          <w:color w:val="222222"/>
+        </w:rPr>
+        <w:t xml:space="preserve">{%p </w:t>
+      </w:r>
+      <w:proofErr w:type="gramStart"/>
+      <w:r>
+        <w:rPr>
+          <w:color w:val="222222"/>
+        </w:rPr>
+        <w:t>endif %}</w:t>
+      </w:r>
+      <w:proofErr w:type="gramEnd"/>
+    </w:p>
+    <w:p>
+      <w:pPr>
+        <w:spacing w:before="180" w:after="180"/>
+        <w:rPr>
+          <w:color w:val="BFBFBF" w:themeColor="background1" w:themeShade="BF"/>
+        </w:rPr>
+      </w:pPr>
+      <w:r>
+        <w:rPr>
+          <w:color w:val="222222"/>
+        </w:rPr>
+        <w:t xml:space="preserve">{%p </w:t>
+      </w:r>
+      <w:proofErr w:type="gramStart"/>
+      <w:r>
+        <w:rPr>
+          <w:color w:val="222222"/>
+        </w:rPr>
+        <w:t>endif %}</w:t>
+      </w:r>
+      <w:proofErr w:type="gramEnd"/>
+      <w:r>
+        <w:rPr>
+          <w:color w:val="222222"/>
+        </w:rPr>
         <w:t xml:space="preserve"> </w:t>
-      </w:r>
-      <w:proofErr w:type="spellStart"/>
-      <w:r>
-        <w:rPr>
-          <w:color w:val="222222"/>
-        </w:rPr>
-        <w:t>county_choice</w:t>
-      </w:r>
-      <w:proofErr w:type="spellEnd"/>
-      <w:r>
-        <w:rPr>
-          <w:color w:val="222222"/>
-        </w:rPr>
-        <w:t xml:space="preserve"> != “</w:t>
-      </w:r>
-      <w:r>
-        <w:rPr>
-          <w:color w:val="222222"/>
-        </w:rPr>
-        <w:t>Oakland</w:t>
-      </w:r>
-      <w:r>
-        <w:rPr>
-          <w:color w:val="222222"/>
-        </w:rPr>
-        <w:t>” %}If you are filing in person at the court clerk's office, give the clerk all of the originals and all of the copies. {% endif %}</w:t>
-      </w:r>
-      <w:r>
-        <w:rPr>
-          <w:color w:val="222222"/>
-        </w:rPr>
-        <w:t xml:space="preserve">{% if </w:t>
-      </w:r>
-      <w:proofErr w:type="spellStart"/>
-      <w:r>
-        <w:rPr>
-          <w:color w:val="222222"/>
-        </w:rPr>
-        <w:t>county_choice</w:t>
-      </w:r>
-      <w:proofErr w:type="spellEnd"/>
-      <w:r>
-        <w:rPr>
-          <w:color w:val="222222"/>
-        </w:rPr>
-        <w:t xml:space="preserve"> != “</w:t>
-      </w:r>
-      <w:r>
-        <w:rPr>
-          <w:color w:val="222222"/>
-        </w:rPr>
-        <w:t>Oakland</w:t>
-      </w:r>
-      <w:r>
-        <w:rPr>
-          <w:color w:val="222222"/>
-        </w:rPr>
-        <w:t>” %}</w:t>
-      </w:r>
-      <w:r>
-        <w:rPr>
-          <w:color w:val="222222"/>
-        </w:rPr>
-        <w:t>The clerk will assign a case number and a judge to your case and will stamp and sign the Summons. The clerk will return copies of all the divorce papers that the court doesn’t need.</w:t>
-      </w:r>
-      <w:r>
-        <w:rPr>
-          <w:color w:val="222222"/>
-        </w:rPr>
-        <w:t xml:space="preserve">{% if </w:t>
-      </w:r>
-      <w:proofErr w:type="spellStart"/>
-      <w:r>
-        <w:rPr>
-          <w:color w:val="222222"/>
-        </w:rPr>
-        <w:t>county_choice</w:t>
-      </w:r>
-      <w:proofErr w:type="spellEnd"/>
-      <w:r>
-        <w:rPr>
-          <w:color w:val="222222"/>
-        </w:rPr>
-        <w:t xml:space="preserve"> </w:t>
-      </w:r>
-      <w:r>
-        <w:rPr>
-          <w:color w:val="222222"/>
-        </w:rPr>
-        <w:t>not in</w:t>
-      </w:r>
-      <w:r>
-        <w:rPr>
-          <w:color w:val="222222"/>
-        </w:rPr>
-        <w:t xml:space="preserve"> “</w:t>
-      </w:r>
-      <w:proofErr w:type="spellStart"/>
-      <w:r>
-        <w:rPr>
-          <w:color w:val="222222"/>
-        </w:rPr>
-        <w:t>Allegan</w:t>
-      </w:r>
-      <w:r>
-        <w:rPr>
-          <w:color w:val="222222"/>
-        </w:rPr>
-        <w:t>|Ingham</w:t>
-      </w:r>
-      <w:r>
-        <w:rPr>
-          <w:color w:val="222222"/>
-        </w:rPr>
-        <w:t>|Lenawee</w:t>
-      </w:r>
-      <w:r>
-        <w:rPr>
-          <w:color w:val="222222"/>
-        </w:rPr>
-        <w:t>|Oscoda</w:t>
-      </w:r>
-      <w:r>
-        <w:rPr>
-          <w:color w:val="222222"/>
-        </w:rPr>
-        <w:t>|Ottawa</w:t>
-      </w:r>
-      <w:proofErr w:type="spellEnd"/>
-      <w:r>
-        <w:rPr>
-          <w:color w:val="222222"/>
-        </w:rPr>
-        <w:t>” %}</w:t>
-      </w:r>
-      <w:r>
-        <w:rPr>
-          <w:color w:val="222222"/>
-        </w:rPr>
-        <w:t xml:space="preserve"> </w:t>
-      </w:r>
-      <w:r>
-        <w:rPr>
-          <w:color w:val="222222"/>
-        </w:rPr>
-        <w:t>If you are e-filing or email filing, upload PDFs of each form to the e-filing platfor</w:t>
-      </w:r>
-      <w:r>
-        <w:rPr>
-          <w:color w:val="222222"/>
-        </w:rPr>
-        <w:t>m or to an email and submit it.</w:t>
-      </w:r>
-      <w:r>
-        <w:rPr>
-          <w:color w:val="222222"/>
-        </w:rPr>
-        <w:t xml:space="preserve"> </w:t>
-      </w:r>
-      <w:r>
-        <w:rPr>
-          <w:color w:val="222222"/>
-        </w:rPr>
-        <w:t>{% endif %}{% endif %}</w:t>
-      </w:r>
-    </w:p>
-    <w:p>
-      <w:pPr>
-        <w:spacing w:before="180" w:after="180"/>
-        <w:rPr>
-          <w:color w:val="222222"/>
-        </w:rPr>
-      </w:pPr>
-      <w:r>
-        <w:rPr>
-          <w:color w:val="222222"/>
-        </w:rPr>
-        <w:t xml:space="preserve">{%p if </w:t>
-      </w:r>
-      <w:proofErr w:type="spellStart"/>
-      <w:r>
-        <w:rPr>
-          <w:color w:val="222222"/>
-        </w:rPr>
-        <w:t>county_choice</w:t>
-      </w:r>
-      <w:proofErr w:type="spellEnd"/>
-      <w:r>
-        <w:rPr>
-          <w:color w:val="222222"/>
-        </w:rPr>
-        <w:t xml:space="preserve"> == “Lenawee” %}</w:t>
-      </w:r>
-    </w:p>
-    <w:p>
-      <w:pPr>
-        <w:spacing w:before="180" w:after="180"/>
-        <w:rPr>
-          <w:color w:val="222222"/>
-        </w:rPr>
-      </w:pPr>
-      <w:r>
-        <w:rPr>
-          <w:color w:val="222222"/>
-        </w:rPr>
-        <w:t xml:space="preserve">The clerk will also give you a yellow form called Pre-Trial Notice &amp;/or Notice of Taking Judgment. </w:t>
-      </w:r>
-      <w:r>
-        <w:rPr>
-          <w:color w:val="222222"/>
-        </w:rPr>
-        <w:t>Serve this form on your spouse, and keep a copy for yourself. (Step 6).</w:t>
-      </w:r>
-    </w:p>
-    <w:p>
-      <w:pPr>
-        <w:spacing w:before="180" w:after="180"/>
-        <w:rPr>
-          <w:color w:val="222222"/>
-        </w:rPr>
-      </w:pPr>
-      <w:r>
-        <w:rPr>
-          <w:color w:val="222222"/>
-        </w:rPr>
-        <w:t>When you file your forms, you must also schedule a date for an intake meeting with the Friend of the Court (See step 8).</w:t>
-      </w:r>
-    </w:p>
-    <w:p>
-      <w:pPr>
-        <w:spacing w:before="180" w:after="180"/>
-        <w:rPr>
-          <w:color w:val="222222"/>
-        </w:rPr>
-      </w:pPr>
-      <w:r>
-        <w:rPr>
-          <w:color w:val="222222"/>
-        </w:rPr>
-        <w:t>{%p endif %}</w:t>
-      </w:r>
-    </w:p>
-    <w:p>
-      <w:pPr>
-        <w:spacing w:before="180" w:after="180"/>
-        <w:rPr>
-          <w:color w:val="BFBFBF" w:themeColor="background1" w:themeShade="BF"/>
-        </w:rPr>
-      </w:pPr>
-      <w:r>
-        <w:rPr>
-          <w:color w:val="222222"/>
-        </w:rPr>
-        <w:t xml:space="preserve">{%p endif %} </w:t>
       </w:r>
       <w:r>
         <w:rPr>
@@ -4795,7 +5822,7 @@
         </w:rPr>
         <w:t xml:space="preserve">You must have your spouse served with (notified of) the divorce action. There are several different ways you can have papers served on your spouse. For more detailed information, see the article </w:t>
       </w:r>
-      <w:hyperlink r:id="rId39" w:history="1">
+      <w:hyperlink r:id="rId40" w:history="1">
         <w:r>
           <w:rPr>
             <w:rStyle w:val="Hyperlink"/>
@@ -4876,7 +5903,21 @@
         <w:rPr>
           <w:color w:val="222222"/>
         </w:rPr>
-        <w:t>Complaint for Divorce with Children</w:t>
+        <w:t xml:space="preserve">Complaint </w:t>
+      </w:r>
+      <w:proofErr w:type="gramStart"/>
+      <w:r>
+        <w:rPr>
+          <w:color w:val="222222"/>
+        </w:rPr>
+        <w:t>for</w:t>
+      </w:r>
+      <w:proofErr w:type="gramEnd"/>
+      <w:r>
+        <w:rPr>
+          <w:color w:val="222222"/>
+        </w:rPr>
+        <w:t xml:space="preserve"> Divorce with Children</w:t>
       </w:r>
     </w:p>
     <w:p>
@@ -4980,221 +6021,6 @@
           <w:color w:val="222222"/>
         </w:rPr>
         <w:t>Pre-Trial Notice &amp;/or Notice of Taking Judgment (yellow form)</w:t>
-      </w:r>
-    </w:p>
-    <w:p>
-      <w:pPr>
-        <w:pStyle w:val="ListParagraph"/>
-        <w:numPr>
-          <w:ilvl w:val="0"/>
-          <w:numId w:val="6"/>
-        </w:numPr>
-        <w:rPr>
-          <w:color w:val="222222"/>
-        </w:rPr>
-      </w:pPr>
-      <w:r>
-        <w:rPr>
-          <w:color w:val="222222"/>
-        </w:rPr>
-        <w:t xml:space="preserve">Friend of the Court Handbook.  (Print a copy of this </w:t>
-      </w:r>
-      <w:hyperlink r:id="rId40" w:history="1">
-        <w:r>
-          <w:rPr>
-            <w:rStyle w:val="Hyperlink"/>
-            <w:color w:val="1155CC"/>
-          </w:rPr>
-          <w:t>Handbook</w:t>
-        </w:r>
-      </w:hyperlink>
-      <w:r>
-        <w:rPr>
-          <w:color w:val="222222"/>
-        </w:rPr>
-        <w:t xml:space="preserve"> from the Michigan One Court of Justice website.)</w:t>
-      </w:r>
-    </w:p>
-    <w:p>
-      <w:pPr>
-        <w:spacing w:before="180" w:after="180"/>
-        <w:rPr>
-          <w:color w:val="222222"/>
-        </w:rPr>
-      </w:pPr>
-      <w:r>
-        <w:rPr>
-          <w:color w:val="222222"/>
-          <w:highlight w:val="white"/>
-        </w:rPr>
-        <w:t xml:space="preserve">{%p </w:t>
-      </w:r>
-      <w:proofErr w:type="spellStart"/>
-      <w:r>
-        <w:rPr>
-          <w:color w:val="222222"/>
-          <w:highlight w:val="white"/>
-        </w:rPr>
-        <w:t>el</w:t>
-      </w:r>
-      <w:r>
-        <w:rPr>
-          <w:color w:val="222222"/>
-          <w:highlight w:val="white"/>
-        </w:rPr>
-        <w:t>if</w:t>
-      </w:r>
-      <w:proofErr w:type="spellEnd"/>
-      <w:r>
-        <w:rPr>
-          <w:color w:val="222222"/>
-          <w:highlight w:val="white"/>
-        </w:rPr>
-        <w:t xml:space="preserve"> </w:t>
-      </w:r>
-      <w:proofErr w:type="spellStart"/>
-      <w:r>
-        <w:rPr>
-          <w:color w:val="222222"/>
-          <w:highlight w:val="white"/>
-        </w:rPr>
-        <w:t>county_choice</w:t>
-      </w:r>
-      <w:proofErr w:type="spellEnd"/>
-      <w:r>
-        <w:rPr>
-          <w:color w:val="222222"/>
-          <w:highlight w:val="white"/>
-        </w:rPr>
-        <w:t xml:space="preserve"> </w:t>
-      </w:r>
-      <w:r>
-        <w:rPr>
-          <w:color w:val="222222"/>
-          <w:highlight w:val="white"/>
-        </w:rPr>
-        <w:t>=</w:t>
-      </w:r>
-      <w:r>
-        <w:rPr>
-          <w:color w:val="222222"/>
-          <w:highlight w:val="white"/>
-        </w:rPr>
-        <w:t>= “</w:t>
-      </w:r>
-      <w:r>
-        <w:rPr>
-          <w:color w:val="222222"/>
-          <w:highlight w:val="white"/>
-        </w:rPr>
-        <w:t>Wayne</w:t>
-      </w:r>
-      <w:r>
-        <w:rPr>
-          <w:color w:val="222222"/>
-          <w:highlight w:val="white"/>
-        </w:rPr>
-        <w:t>” %}</w:t>
-      </w:r>
-    </w:p>
-    <w:p>
-      <w:pPr>
-        <w:pStyle w:val="ListParagraph"/>
-        <w:numPr>
-          <w:ilvl w:val="0"/>
-          <w:numId w:val="15"/>
-        </w:numPr>
-        <w:rPr>
-          <w:color w:val="222222"/>
-        </w:rPr>
-      </w:pPr>
-      <w:r>
-        <w:rPr>
-          <w:color w:val="222222"/>
-        </w:rPr>
-        <w:t xml:space="preserve">Certificate on Behalf of Plaintiff Without Ex </w:t>
-      </w:r>
-      <w:proofErr w:type="spellStart"/>
-      <w:r>
-        <w:rPr>
-          <w:color w:val="222222"/>
-        </w:rPr>
-        <w:t>Parte</w:t>
-      </w:r>
-      <w:proofErr w:type="spellEnd"/>
-      <w:r>
-        <w:rPr>
-          <w:color w:val="222222"/>
-        </w:rPr>
-        <w:t xml:space="preserve"> Interim Order for Custody, Support, And/or Parenting Time </w:t>
-      </w:r>
-    </w:p>
-    <w:p>
-      <w:pPr>
-        <w:spacing w:before="180" w:after="180"/>
-        <w:rPr>
-          <w:color w:val="222222"/>
-        </w:rPr>
-      </w:pPr>
-      <w:r>
-        <w:rPr>
-          <w:color w:val="222222"/>
-          <w:highlight w:val="white"/>
-        </w:rPr>
-        <w:t xml:space="preserve">{%p </w:t>
-      </w:r>
-      <w:proofErr w:type="spellStart"/>
-      <w:r>
-        <w:rPr>
-          <w:color w:val="222222"/>
-          <w:highlight w:val="white"/>
-        </w:rPr>
-        <w:t>el</w:t>
-      </w:r>
-      <w:r>
-        <w:rPr>
-          <w:color w:val="222222"/>
-          <w:highlight w:val="white"/>
-        </w:rPr>
-        <w:t>if</w:t>
-      </w:r>
-      <w:proofErr w:type="spellEnd"/>
-      <w:r>
-        <w:rPr>
-          <w:color w:val="222222"/>
-          <w:highlight w:val="white"/>
-        </w:rPr>
-        <w:t xml:space="preserve"> </w:t>
-      </w:r>
-      <w:proofErr w:type="spellStart"/>
-      <w:r>
-        <w:rPr>
-          <w:color w:val="222222"/>
-          <w:highlight w:val="white"/>
-        </w:rPr>
-        <w:t>county_choice</w:t>
-      </w:r>
-      <w:proofErr w:type="spellEnd"/>
-      <w:r>
-        <w:rPr>
-          <w:color w:val="222222"/>
-          <w:highlight w:val="white"/>
-        </w:rPr>
-        <w:t xml:space="preserve"> == “</w:t>
-      </w:r>
-      <w:r>
-        <w:rPr>
-          <w:color w:val="222222"/>
-          <w:highlight w:val="white"/>
-        </w:rPr>
-        <w:t>Oakland</w:t>
-      </w:r>
-      <w:r>
-        <w:rPr>
-          <w:color w:val="222222"/>
-          <w:highlight w:val="white"/>
-        </w:rPr>
-        <w:t>” %}</w:t>
       </w:r>
     </w:p>
     <w:p>
@@ -5232,20 +6058,116 @@
     </w:p>
     <w:p>
       <w:pPr>
+        <w:spacing w:before="180" w:after="180"/>
+        <w:rPr>
+          <w:color w:val="222222"/>
+        </w:rPr>
+      </w:pPr>
+      <w:r>
+        <w:rPr>
+          <w:color w:val="222222"/>
+          <w:highlight w:val="white"/>
+        </w:rPr>
+        <w:t xml:space="preserve">{%p </w:t>
+      </w:r>
+      <w:proofErr w:type="spellStart"/>
+      <w:r>
+        <w:rPr>
+          <w:color w:val="222222"/>
+          <w:highlight w:val="white"/>
+        </w:rPr>
+        <w:t>el</w:t>
+      </w:r>
+      <w:r>
+        <w:rPr>
+          <w:color w:val="222222"/>
+          <w:highlight w:val="white"/>
+        </w:rPr>
+        <w:t>if</w:t>
+      </w:r>
+      <w:proofErr w:type="spellEnd"/>
+      <w:r>
+        <w:rPr>
+          <w:color w:val="222222"/>
+          <w:highlight w:val="white"/>
+        </w:rPr>
+        <w:t xml:space="preserve"> </w:t>
+      </w:r>
+      <w:proofErr w:type="spellStart"/>
+      <w:r>
+        <w:rPr>
+          <w:color w:val="222222"/>
+          <w:highlight w:val="white"/>
+        </w:rPr>
+        <w:t>county_choice</w:t>
+      </w:r>
+      <w:proofErr w:type="spellEnd"/>
+      <w:r>
+        <w:rPr>
+          <w:color w:val="222222"/>
+          <w:highlight w:val="white"/>
+        </w:rPr>
+        <w:t xml:space="preserve"> </w:t>
+      </w:r>
+      <w:r>
+        <w:rPr>
+          <w:color w:val="222222"/>
+          <w:highlight w:val="white"/>
+        </w:rPr>
+        <w:t>=</w:t>
+      </w:r>
+      <w:r>
+        <w:rPr>
+          <w:color w:val="222222"/>
+          <w:highlight w:val="white"/>
+        </w:rPr>
+        <w:t>= “</w:t>
+      </w:r>
+      <w:r>
+        <w:rPr>
+          <w:color w:val="222222"/>
+          <w:highlight w:val="white"/>
+        </w:rPr>
+        <w:t>Wayne</w:t>
+      </w:r>
+      <w:r>
+        <w:rPr>
+          <w:color w:val="222222"/>
+          <w:highlight w:val="white"/>
+        </w:rPr>
+        <w:t>” %}</w:t>
+      </w:r>
+    </w:p>
+    <w:p>
+      <w:pPr>
         <w:pStyle w:val="ListParagraph"/>
         <w:numPr>
           <w:ilvl w:val="0"/>
-          <w:numId w:val="6"/>
+          <w:numId w:val="15"/>
         </w:numPr>
-      </w:pPr>
-      <w:r>
-        <w:rPr>
-          <w:color w:val="222222"/>
-        </w:rPr>
-        <w:t>Order for</w:t>
-      </w:r>
-      <w:r>
-        <w:t xml:space="preserve"> Information Exchange SMILE Program Attendance and Early Intervention Conference</w:t>
+        <w:rPr>
+          <w:color w:val="222222"/>
+        </w:rPr>
+      </w:pPr>
+      <w:r>
+        <w:rPr>
+          <w:color w:val="222222"/>
+        </w:rPr>
+        <w:t xml:space="preserve">Certificate on Behalf of Plaintiff Without Ex </w:t>
+      </w:r>
+      <w:proofErr w:type="spellStart"/>
+      <w:r>
+        <w:rPr>
+          <w:color w:val="222222"/>
+        </w:rPr>
+        <w:t>Parte</w:t>
+      </w:r>
+      <w:proofErr w:type="spellEnd"/>
+      <w:r>
+        <w:rPr>
+          <w:color w:val="222222"/>
+        </w:rPr>
+        <w:t xml:space="preserve"> Interim Order for Custody, Support, And/or Parenting Time </w:t>
       </w:r>
     </w:p>
     <w:p>
@@ -5260,21 +6182,60 @@
           <w:color w:val="222222"/>
           <w:highlight w:val="white"/>
         </w:rPr>
-        <w:t>{%p</w:t>
-      </w:r>
+        <w:t xml:space="preserve">{%p </w:t>
+      </w:r>
+      <w:proofErr w:type="spellStart"/>
       <w:r>
         <w:rPr>
           <w:color w:val="222222"/>
           <w:highlight w:val="white"/>
         </w:rPr>
-        <w:t xml:space="preserve"> else</w:t>
+        <w:t>el</w:t>
       </w:r>
       <w:r>
         <w:rPr>
           <w:color w:val="222222"/>
           <w:highlight w:val="white"/>
         </w:rPr>
-        <w:t xml:space="preserve"> %}</w:t>
+        <w:t>if</w:t>
+      </w:r>
+      <w:proofErr w:type="spellEnd"/>
+      <w:r>
+        <w:rPr>
+          <w:color w:val="222222"/>
+          <w:highlight w:val="white"/>
+        </w:rPr>
+        <w:t xml:space="preserve"> </w:t>
+      </w:r>
+      <w:proofErr w:type="spellStart"/>
+      <w:r>
+        <w:rPr>
+          <w:color w:val="222222"/>
+          <w:highlight w:val="white"/>
+        </w:rPr>
+        <w:t>county_choice</w:t>
+      </w:r>
+      <w:proofErr w:type="spellEnd"/>
+      <w:r>
+        <w:rPr>
+          <w:color w:val="222222"/>
+          <w:highlight w:val="white"/>
+        </w:rPr>
+        <w:t xml:space="preserve"> == “</w:t>
+      </w:r>
+      <w:r>
+        <w:rPr>
+          <w:color w:val="222222"/>
+          <w:highlight w:val="white"/>
+        </w:rPr>
+        <w:t>Oakland</w:t>
+      </w:r>
+      <w:r>
+        <w:rPr>
+          <w:color w:val="222222"/>
+          <w:highlight w:val="white"/>
+        </w:rPr>
+        <w:t>” %}</w:t>
       </w:r>
     </w:p>
     <w:p>
@@ -5312,17 +6273,114 @@
     </w:p>
     <w:p>
       <w:pPr>
-        <w:spacing w:before="180" w:after="180"/>
-        <w:rPr>
-          <w:color w:val="222222"/>
-        </w:rPr>
-      </w:pPr>
-      <w:r>
-        <w:rPr>
-          <w:color w:val="222222"/>
-        </w:rPr>
-        <w:t>{%p endif %}</w:t>
-      </w:r>
+        <w:pStyle w:val="ListParagraph"/>
+        <w:numPr>
+          <w:ilvl w:val="0"/>
+          <w:numId w:val="6"/>
+        </w:numPr>
+      </w:pPr>
+      <w:r>
+        <w:rPr>
+          <w:color w:val="222222"/>
+        </w:rPr>
+        <w:t>Order for</w:t>
+      </w:r>
+      <w:r>
+        <w:t xml:space="preserve"> Information Exchange SMILE Program Attendance and Early Intervention Conference</w:t>
+      </w:r>
+    </w:p>
+    <w:p>
+      <w:pPr>
+        <w:spacing w:before="180" w:after="180"/>
+        <w:rPr>
+          <w:color w:val="222222"/>
+        </w:rPr>
+      </w:pPr>
+      <w:r>
+        <w:rPr>
+          <w:color w:val="222222"/>
+          <w:highlight w:val="white"/>
+        </w:rPr>
+        <w:t>{%p</w:t>
+      </w:r>
+      <w:r>
+        <w:rPr>
+          <w:color w:val="222222"/>
+          <w:highlight w:val="white"/>
+        </w:rPr>
+        <w:t xml:space="preserve"> </w:t>
+      </w:r>
+      <w:proofErr w:type="gramStart"/>
+      <w:r>
+        <w:rPr>
+          <w:color w:val="222222"/>
+          <w:highlight w:val="white"/>
+        </w:rPr>
+        <w:t>else</w:t>
+      </w:r>
+      <w:r>
+        <w:rPr>
+          <w:color w:val="222222"/>
+          <w:highlight w:val="white"/>
+        </w:rPr>
+        <w:t xml:space="preserve"> %}</w:t>
+      </w:r>
+      <w:proofErr w:type="gramEnd"/>
+    </w:p>
+    <w:p>
+      <w:pPr>
+        <w:pStyle w:val="ListParagraph"/>
+        <w:numPr>
+          <w:ilvl w:val="0"/>
+          <w:numId w:val="6"/>
+        </w:numPr>
+        <w:rPr>
+          <w:color w:val="222222"/>
+        </w:rPr>
+      </w:pPr>
+      <w:r>
+        <w:rPr>
+          <w:color w:val="222222"/>
+        </w:rPr>
+        <w:t xml:space="preserve">Friend of the Court Handbook.  (Print a copy of this </w:t>
+      </w:r>
+      <w:hyperlink r:id="rId43" w:history="1">
+        <w:r>
+          <w:rPr>
+            <w:rStyle w:val="Hyperlink"/>
+            <w:color w:val="1155CC"/>
+          </w:rPr>
+          <w:t>Handbook</w:t>
+        </w:r>
+      </w:hyperlink>
+      <w:r>
+        <w:rPr>
+          <w:color w:val="222222"/>
+        </w:rPr>
+        <w:t xml:space="preserve"> from the Michigan One Court of Justice website.)</w:t>
+      </w:r>
+    </w:p>
+    <w:p>
+      <w:pPr>
+        <w:spacing w:before="180" w:after="180"/>
+        <w:rPr>
+          <w:color w:val="222222"/>
+        </w:rPr>
+      </w:pPr>
+      <w:r>
+        <w:rPr>
+          <w:color w:val="222222"/>
+        </w:rPr>
+        <w:t xml:space="preserve">{%p </w:t>
+      </w:r>
+      <w:proofErr w:type="gramStart"/>
+      <w:r>
+        <w:rPr>
+          <w:color w:val="222222"/>
+        </w:rPr>
+        <w:t>endif %}</w:t>
+      </w:r>
+      <w:proofErr w:type="gramEnd"/>
     </w:p>
     <w:p>
       <w:pPr>
@@ -5337,7 +6395,7 @@
         </w:rPr>
         <w:t xml:space="preserve">You have 91 days from the issue date on the Summons to have your spouse served with the divorce papers, or your case will be dismissed. If you are having trouble getting your spouse served in this time, you can file a </w:t>
       </w:r>
-      <w:hyperlink r:id="rId43" w:history="1">
+      <w:hyperlink r:id="rId44" w:history="1">
         <w:r>
           <w:rPr>
             <w:rStyle w:val="Hyperlink"/>
@@ -5376,7 +6434,7 @@
       <w:r>
         <w:t xml:space="preserve">, go to </w:t>
       </w:r>
-      <w:hyperlink r:id="rId44">
+      <w:hyperlink r:id="rId45">
         <w:r>
           <w:rPr>
             <w:color w:val="1155CC"/>

</xml_diff>